<commit_message>
nmv 16 04 2026
</commit_message>
<xml_diff>
--- a/TS Jatai Ghanam Project/TS 1.1/TS 1.1 Ghanam Malayalam Corrections.docx
+++ b/TS Jatai Ghanam Project/TS 1.1/TS 1.1 Ghanam Malayalam Corrections.docx
@@ -1,7 +1,2449 @@
 
 <file path=word/document.xml><?xml version="1.0" encoding="utf-8"?>
-<w:document xmlns:wpc="http://schemas.microsoft.com/office/word/2010/wordprocessingCanvas" xmlns:cx="http://schemas.microsoft.com/office/drawing/2014/chartex" xmlns:cx1="http://schemas.microsoft.com/office/drawing/2015/9/8/chartex" xmlns:cx2="http://schemas.microsoft.com/office/drawing/2015/10/21/chartex" xmlns:cx3="http://schemas.microsoft.com/office/drawing/2016/5/9/chartex" xmlns:cx4="http://schemas.microsoft.com/office/drawing/2016/5/10/chartex" xmlns:cx5="http://schemas.microsoft.com/office/drawing/2016/5/11/chartex" xmlns:cx6="http://schemas.microsoft.com/office/drawing/2016/5/12/chartex" xmlns:cx7="http://schemas.microsoft.com/office/drawing/2016/5/13/chartex" xmlns:cx8="http://schemas.microsoft.com/office/drawing/2016/5/14/chartex" xmlns:mc="http://schemas.openxmlformats.org/markup-compatibility/2006" xmlns:aink="http://schemas.microsoft.com/office/drawing/2016/ink" xmlns:am3d="http://schemas.microsoft.com/office/drawing/2017/model3d" xmlns:o="urn:schemas-microsoft-com:office:office" xmlns:oel="http://schemas.microsoft.com/office/2019/extlst" xmlns:r="http://schemas.openxmlformats.org/officeDocument/2006/relationships" xmlns:m="http://schemas.openxmlformats.org/officeDocument/2006/math" xmlns:v="urn:schemas-microsoft-com:vml" xmlns:wp14="http://schemas.microsoft.com/office/word/2010/wordprocessingDrawing" xmlns:wp="http://schemas.openxmlformats.org/drawingml/2006/wordprocessingDrawing" xmlns:w10="urn:schemas-microsoft-com:office:word" xmlns:w="http://schemas.openxmlformats.org/wordprocessingml/2006/main" xmlns:w14="http://schemas.microsoft.com/office/word/2010/wordml" xmlns:w15="http://schemas.microsoft.com/office/word/2012/wordml" xmlns:w16cex="http://schemas.microsoft.com/office/word/2018/wordml/cex" xmlns:w16cid="http://schemas.microsoft.com/office/word/2016/wordml/cid" xmlns:w16="http://schemas.microsoft.com/office/word/2018/wordml" xmlns:w16sdtdh="http://schemas.microsoft.com/office/word/2020/wordml/sdtdatahash" xmlns:w16se="http://schemas.microsoft.com/office/word/2015/wordml/symex" xmlns:wpg="http://schemas.microsoft.com/office/word/2010/wordprocessingGroup" xmlns:wpi="http://schemas.microsoft.com/office/word/2010/wordprocessingInk" xmlns:wne="http://schemas.microsoft.com/office/word/2006/wordml" xmlns:wps="http://schemas.microsoft.com/office/word/2010/wordprocessingShape" mc:Ignorable="w14 w15 w16se w16cid w16 w16cex w16sdtdh wp14">
+<w:document xmlns:wpc="http://schemas.microsoft.com/office/word/2010/wordprocessingCanvas" xmlns:cx="http://schemas.microsoft.com/office/drawing/2014/chartex" xmlns:cx1="http://schemas.microsoft.com/office/drawing/2015/9/8/chartex" xmlns:cx2="http://schemas.microsoft.com/office/drawing/2015/10/21/chartex" xmlns:cx3="http://schemas.microsoft.com/office/drawing/2016/5/9/chartex" xmlns:cx4="http://schemas.microsoft.com/office/drawing/2016/5/10/chartex" xmlns:cx5="http://schemas.microsoft.com/office/drawing/2016/5/11/chartex" xmlns:cx6="http://schemas.microsoft.com/office/drawing/2016/5/12/chartex" xmlns:cx7="http://schemas.microsoft.com/office/drawing/2016/5/13/chartex" xmlns:cx8="http://schemas.microsoft.com/office/drawing/2016/5/14/chartex" xmlns:mc="http://schemas.openxmlformats.org/markup-compatibility/2006" xmlns:aink="http://schemas.microsoft.com/office/drawing/2016/ink" xmlns:am3d="http://schemas.microsoft.com/office/drawing/2017/model3d" xmlns:o="urn:schemas-microsoft-com:office:office" xmlns:oel="http://schemas.microsoft.com/office/2019/extlst" xmlns:r="http://schemas.openxmlformats.org/officeDocument/2006/relationships" xmlns:m="http://schemas.openxmlformats.org/officeDocument/2006/math" xmlns:v="urn:schemas-microsoft-com:vml" xmlns:wp14="http://schemas.microsoft.com/office/word/2010/wordprocessingDrawing" xmlns:wp="http://schemas.openxmlformats.org/drawingml/2006/wordprocessingDrawing" xmlns:w10="urn:schemas-microsoft-com:office:word" xmlns:w="http://schemas.openxmlformats.org/wordprocessingml/2006/main" xmlns:w14="http://schemas.microsoft.com/office/word/2010/wordml" xmlns:w15="http://schemas.microsoft.com/office/word/2012/wordml" xmlns:w16cex="http://schemas.microsoft.com/office/word/2018/wordml/cex" xmlns:w16cid="http://schemas.microsoft.com/office/word/2016/wordml/cid" xmlns:w16="http://schemas.microsoft.com/office/word/2018/wordml" xmlns:w16du="http://schemas.microsoft.com/office/word/2023/wordml/word16du" xmlns:w16sdtdh="http://schemas.microsoft.com/office/word/2020/wordml/sdtdatahash" xmlns:w16sdtfl="http://schemas.microsoft.com/office/word/2024/wordml/sdtformatlock" xmlns:w16se="http://schemas.microsoft.com/office/word/2015/wordml/symex" xmlns:wpg="http://schemas.microsoft.com/office/word/2010/wordprocessingGroup" xmlns:wpi="http://schemas.microsoft.com/office/word/2010/wordprocessingInk" xmlns:wne="http://schemas.microsoft.com/office/word/2006/wordml" xmlns:wps="http://schemas.microsoft.com/office/word/2010/wordprocessingShape" mc:Ignorable="w14 w15 w16se w16cid w16 w16cex w16sdtdh w16sdtfl w16du wp14">
   <w:body>
+    <w:p>
+      <w:pPr>
+        <w:spacing w:before="0" w:line="240" w:lineRule="auto"/>
+        <w:jc w:val="center"/>
+        <w:rPr>
+          <w:b/>
+          <w:bCs/>
+          <w:sz w:val="32"/>
+          <w:szCs w:val="32"/>
+          <w:u w:val="single"/>
+        </w:rPr>
+      </w:pPr>
+      <w:r>
+        <w:rPr>
+          <w:b/>
+          <w:bCs/>
+          <w:sz w:val="32"/>
+          <w:szCs w:val="32"/>
+          <w:u w:val="single"/>
+        </w:rPr>
+        <w:t xml:space="preserve">TS </w:t>
+      </w:r>
+      <w:r>
+        <w:rPr>
+          <w:b/>
+          <w:bCs/>
+          <w:sz w:val="32"/>
+          <w:szCs w:val="32"/>
+          <w:u w:val="single"/>
+        </w:rPr>
+        <w:t xml:space="preserve">Ghanam </w:t>
+      </w:r>
+      <w:r>
+        <w:rPr>
+          <w:b/>
+          <w:bCs/>
+          <w:sz w:val="32"/>
+          <w:szCs w:val="32"/>
+          <w:u w:val="single"/>
+        </w:rPr>
+        <w:t xml:space="preserve">– TS 1.1 </w:t>
+      </w:r>
+      <w:r>
+        <w:rPr>
+          <w:b/>
+          <w:bCs/>
+          <w:sz w:val="32"/>
+          <w:szCs w:val="32"/>
+          <w:u w:val="single"/>
+        </w:rPr>
+        <w:t xml:space="preserve">Malayalam </w:t>
+      </w:r>
+      <w:r>
+        <w:rPr>
+          <w:b/>
+          <w:bCs/>
+          <w:sz w:val="32"/>
+          <w:szCs w:val="32"/>
+          <w:u w:val="single"/>
+        </w:rPr>
+        <w:t xml:space="preserve">Corrections – Observed till </w:t>
+      </w:r>
+      <w:r>
+        <w:rPr>
+          <w:b/>
+          <w:bCs/>
+          <w:sz w:val="32"/>
+          <w:szCs w:val="32"/>
+          <w:highlight w:val="red"/>
+          <w:u w:val="single"/>
+        </w:rPr>
+        <w:t>????</w:t>
+      </w:r>
+    </w:p>
+    <w:p>
+      <w:pPr>
+        <w:spacing w:before="0" w:line="240" w:lineRule="auto"/>
+        <w:jc w:val="center"/>
+        <w:rPr>
+          <w:b/>
+          <w:bCs/>
+          <w:sz w:val="28"/>
+          <w:szCs w:val="32"/>
+        </w:rPr>
+      </w:pPr>
+      <w:r>
+        <w:rPr>
+          <w:b/>
+          <w:bCs/>
+          <w:sz w:val="28"/>
+          <w:szCs w:val="32"/>
+        </w:rPr>
+        <w:t>(ignore those which are already incorporated in your book’s version and date)</w:t>
+      </w:r>
+    </w:p>
+    <w:tbl>
+      <w:tblPr>
+        <w:tblW w:w="13828" w:type="dxa"/>
+        <w:tblInd w:w="-792" w:type="dxa"/>
+        <w:tblBorders>
+          <w:top w:val="single" w:sz="4" w:space="0" w:color="000000"/>
+          <w:left w:val="single" w:sz="4" w:space="0" w:color="000000"/>
+          <w:bottom w:val="single" w:sz="4" w:space="0" w:color="000000"/>
+          <w:right w:val="single" w:sz="4" w:space="0" w:color="000000"/>
+          <w:insideH w:val="single" w:sz="4" w:space="0" w:color="000000"/>
+          <w:insideV w:val="single" w:sz="4" w:space="0" w:color="000000"/>
+        </w:tblBorders>
+        <w:tblLook w:val="04A0" w:firstRow="1" w:lastRow="0" w:firstColumn="1" w:lastColumn="0" w:noHBand="0" w:noVBand="1"/>
+      </w:tblPr>
+      <w:tblGrid>
+        <w:gridCol w:w="6457"/>
+        <w:gridCol w:w="7371"/>
+      </w:tblGrid>
+      <w:tr>
+        <w:tc>
+          <w:tcPr>
+            <w:tcW w:w="6457" w:type="dxa"/>
+          </w:tcPr>
+          <w:p>
+            <w:pPr>
+              <w:spacing w:before="0" w:line="240" w:lineRule="auto"/>
+              <w:jc w:val="center"/>
+              <w:rPr>
+                <w:b/>
+                <w:sz w:val="32"/>
+                <w:szCs w:val="32"/>
+              </w:rPr>
+            </w:pPr>
+            <w:r>
+              <w:rPr>
+                <w:b/>
+                <w:sz w:val="32"/>
+                <w:szCs w:val="32"/>
+              </w:rPr>
+              <w:t>As Printed</w:t>
+            </w:r>
+          </w:p>
+        </w:tc>
+        <w:tc>
+          <w:tcPr>
+            <w:tcW w:w="7371" w:type="dxa"/>
+          </w:tcPr>
+          <w:p>
+            <w:pPr>
+              <w:spacing w:before="0" w:line="240" w:lineRule="auto"/>
+              <w:ind w:right="-18"/>
+              <w:jc w:val="center"/>
+              <w:rPr>
+                <w:b/>
+                <w:sz w:val="32"/>
+                <w:szCs w:val="32"/>
+              </w:rPr>
+            </w:pPr>
+            <w:r>
+              <w:rPr>
+                <w:b/>
+                <w:sz w:val="32"/>
+                <w:szCs w:val="32"/>
+              </w:rPr>
+              <w:t>To be read as or corrected as</w:t>
+            </w:r>
+          </w:p>
+        </w:tc>
+      </w:tr>
+    </w:tbl>
+    <w:p>
+      <w:pPr>
+        <w:spacing w:before="0" w:line="240" w:lineRule="auto"/>
+        <w:rPr>
+          <w:vanish/>
+          <w:sz w:val="32"/>
+          <w:szCs w:val="32"/>
+        </w:rPr>
+      </w:pPr>
+    </w:p>
+    <w:tbl>
+      <w:tblPr>
+        <w:tblW w:w="13921" w:type="dxa"/>
+        <w:tblInd w:w="-743" w:type="dxa"/>
+        <w:tblBorders>
+          <w:top w:val="single" w:sz="4" w:space="0" w:color="000000"/>
+          <w:left w:val="single" w:sz="4" w:space="0" w:color="000000"/>
+          <w:bottom w:val="single" w:sz="4" w:space="0" w:color="000000"/>
+          <w:right w:val="single" w:sz="4" w:space="0" w:color="000000"/>
+          <w:insideH w:val="single" w:sz="4" w:space="0" w:color="000000"/>
+          <w:insideV w:val="single" w:sz="4" w:space="0" w:color="000000"/>
+        </w:tblBorders>
+        <w:tblLook w:val="04A0" w:firstRow="1" w:lastRow="0" w:firstColumn="1" w:lastColumn="0" w:noHBand="0" w:noVBand="1"/>
+      </w:tblPr>
+      <w:tblGrid>
+        <w:gridCol w:w="6408"/>
+        <w:gridCol w:w="7513"/>
+      </w:tblGrid>
+      <w:tr>
+        <w:trPr>
+          <w:trHeight w:val="2600"/>
+        </w:trPr>
+        <w:tc>
+          <w:tcPr>
+            <w:tcW w:w="6408" w:type="dxa"/>
+          </w:tcPr>
+          <w:p>
+            <w:pPr>
+              <w:widowControl w:val="0"/>
+              <w:autoSpaceDE w:val="0"/>
+              <w:autoSpaceDN w:val="0"/>
+              <w:adjustRightInd w:val="0"/>
+              <w:spacing w:line="240" w:lineRule="auto"/>
+              <w:rPr>
+                <w:rFonts w:ascii="BRH Malayalam Extra" w:hAnsi="BRH Malayalam Extra" w:cs="BRH Malayalam Extra"/>
+                <w:color w:val="000000"/>
+                <w:sz w:val="32"/>
+                <w:szCs w:val="40"/>
+              </w:rPr>
+            </w:pPr>
+            <w:r>
+              <w:rPr>
+                <w:rFonts w:cs="BRH Malayalam Extra"/>
+                <w:color w:val="000000"/>
+                <w:szCs w:val="40"/>
+              </w:rPr>
+              <w:t>44</w:t>
+            </w:r>
+            <w:r>
+              <w:rPr>
+                <w:rFonts w:ascii="BRH Malayalam Extra" w:hAnsi="BRH Malayalam Extra" w:cs="BRH Malayalam Extra"/>
+                <w:color w:val="000000"/>
+                <w:sz w:val="32"/>
+                <w:szCs w:val="40"/>
+              </w:rPr>
+              <w:t>)</w:t>
+            </w:r>
+            <w:r>
+              <w:rPr>
+                <w:rFonts w:ascii="BRH Malayalam Extra" w:hAnsi="BRH Malayalam Extra" w:cs="BRH Malayalam Extra"/>
+                <w:color w:val="000000"/>
+                <w:sz w:val="32"/>
+                <w:szCs w:val="40"/>
+              </w:rPr>
+              <w:tab/>
+            </w:r>
+            <w:r>
+              <w:rPr>
+                <w:rFonts w:cs="BRH Malayalam Extra"/>
+                <w:color w:val="000000"/>
+                <w:szCs w:val="40"/>
+              </w:rPr>
+              <w:t>1</w:t>
+            </w:r>
+            <w:r>
+              <w:rPr>
+                <w:rFonts w:ascii="BRH Malayalam Extra" w:hAnsi="BRH Malayalam Extra" w:cs="BRH Malayalam Extra"/>
+                <w:color w:val="000000"/>
+                <w:sz w:val="32"/>
+                <w:szCs w:val="40"/>
+              </w:rPr>
+              <w:t>.</w:t>
+            </w:r>
+            <w:r>
+              <w:rPr>
+                <w:rFonts w:cs="BRH Malayalam Extra"/>
+                <w:color w:val="000000"/>
+                <w:szCs w:val="40"/>
+              </w:rPr>
+              <w:t>1</w:t>
+            </w:r>
+            <w:r>
+              <w:rPr>
+                <w:rFonts w:ascii="BRH Malayalam Extra" w:hAnsi="BRH Malayalam Extra" w:cs="BRH Malayalam Extra"/>
+                <w:color w:val="000000"/>
+                <w:sz w:val="32"/>
+                <w:szCs w:val="40"/>
+              </w:rPr>
+              <w:t>.</w:t>
+            </w:r>
+            <w:r>
+              <w:rPr>
+                <w:rFonts w:cs="BRH Malayalam Extra"/>
+                <w:color w:val="000000"/>
+                <w:szCs w:val="40"/>
+              </w:rPr>
+              <w:t>9</w:t>
+            </w:r>
+            <w:r>
+              <w:rPr>
+                <w:rFonts w:ascii="BRH Malayalam Extra" w:hAnsi="BRH Malayalam Extra" w:cs="BRH Malayalam Extra"/>
+                <w:color w:val="000000"/>
+                <w:sz w:val="32"/>
+                <w:szCs w:val="40"/>
+              </w:rPr>
+              <w:t>.</w:t>
+            </w:r>
+            <w:r>
+              <w:rPr>
+                <w:rFonts w:cs="BRH Malayalam Extra"/>
+                <w:color w:val="000000"/>
+                <w:szCs w:val="40"/>
+              </w:rPr>
+              <w:t>3</w:t>
+            </w:r>
+            <w:r>
+              <w:rPr>
+                <w:rFonts w:ascii="BRH Malayalam Extra" w:hAnsi="BRH Malayalam Extra" w:cs="BRH Malayalam Extra"/>
+                <w:color w:val="000000"/>
+                <w:sz w:val="32"/>
+                <w:szCs w:val="40"/>
+              </w:rPr>
+              <w:t>(</w:t>
+            </w:r>
+            <w:r>
+              <w:rPr>
+                <w:rFonts w:cs="BRH Malayalam Extra"/>
+                <w:color w:val="000000"/>
+                <w:szCs w:val="40"/>
+              </w:rPr>
+              <w:t>41</w:t>
+            </w:r>
+            <w:r>
+              <w:rPr>
+                <w:rFonts w:ascii="BRH Malayalam Extra" w:hAnsi="BRH Malayalam Extra" w:cs="BRH Malayalam Extra"/>
+                <w:color w:val="000000"/>
+                <w:sz w:val="32"/>
+                <w:szCs w:val="40"/>
+              </w:rPr>
+              <w:t>)- D</w:t>
+            </w:r>
+            <w:r>
+              <w:rPr>
+                <w:rFonts w:ascii="BRH Malayalam Extra" w:hAnsi="BRH Malayalam Extra" w:cs="BRH Malayalam Extra"/>
+                <w:color w:val="000000"/>
+                <w:sz w:val="28"/>
+                <w:szCs w:val="40"/>
+              </w:rPr>
+              <w:t>–</w:t>
+            </w:r>
+            <w:r>
+              <w:rPr>
+                <w:rFonts w:ascii="BRH Malayalam Extra" w:hAnsi="BRH Malayalam Extra" w:cs="BRH Malayalam Extra"/>
+                <w:color w:val="000000"/>
+                <w:sz w:val="32"/>
+                <w:szCs w:val="40"/>
+              </w:rPr>
+              <w:t>ªpz | P</w:t>
+            </w:r>
+            <w:r>
+              <w:rPr>
+                <w:rFonts w:ascii="BRH Malayalam Extra" w:hAnsi="BRH Malayalam Extra" w:cs="BRH Malayalam Extra"/>
+                <w:color w:val="000000"/>
+                <w:sz w:val="28"/>
+                <w:szCs w:val="40"/>
+              </w:rPr>
+              <w:t>–</w:t>
+            </w:r>
+            <w:r>
+              <w:rPr>
+                <w:rFonts w:ascii="BRH Malayalam Extra" w:hAnsi="BRH Malayalam Extra" w:cs="BRH Malayalam Extra"/>
+                <w:color w:val="000000"/>
+                <w:sz w:val="32"/>
+                <w:szCs w:val="40"/>
+              </w:rPr>
+              <w:t xml:space="preserve"> | </w:t>
+            </w:r>
+            <w:r>
+              <w:rPr>
+                <w:rFonts w:ascii="BRH Malayalam Extra" w:hAnsi="BRH Malayalam Extra" w:cs="BRH Malayalam Extra"/>
+                <w:color w:val="000000"/>
+                <w:sz w:val="32"/>
+                <w:szCs w:val="40"/>
+                <w:highlight w:val="yellow"/>
+              </w:rPr>
+              <w:t>A</w:t>
+            </w:r>
+            <w:r>
+              <w:rPr>
+                <w:rFonts w:ascii="BRH Malayalam Extra" w:hAnsi="BRH Malayalam Extra" w:cs="BRH Malayalam Extra"/>
+                <w:color w:val="000000"/>
+                <w:sz w:val="28"/>
+                <w:szCs w:val="40"/>
+                <w:highlight w:val="yellow"/>
+              </w:rPr>
+              <w:t>–</w:t>
+            </w:r>
+            <w:r>
+              <w:rPr>
+                <w:rFonts w:ascii="BRH Malayalam Extra" w:hAnsi="BRH Malayalam Extra" w:cs="BRH Malayalam Extra"/>
+                <w:color w:val="000000"/>
+                <w:sz w:val="32"/>
+                <w:szCs w:val="40"/>
+                <w:highlight w:val="yellow"/>
+              </w:rPr>
+              <w:t>sy</w:t>
+            </w:r>
+            <w:r>
+              <w:rPr>
+                <w:rFonts w:ascii="BRH Malayalam Extra" w:hAnsi="BRH Malayalam Extra" w:cs="BRH Malayalam Extra"/>
+                <w:color w:val="000000"/>
+                <w:sz w:val="28"/>
+                <w:szCs w:val="40"/>
+                <w:highlight w:val="yellow"/>
+              </w:rPr>
+              <w:t>–</w:t>
+            </w:r>
+            <w:r>
+              <w:rPr>
+                <w:rFonts w:ascii="BRH Malayalam Extra" w:hAnsi="BRH Malayalam Extra" w:cs="BRH Malayalam Extra"/>
+                <w:color w:val="000000"/>
+                <w:sz w:val="32"/>
+                <w:szCs w:val="40"/>
+              </w:rPr>
+              <w:t xml:space="preserve"> | </w:t>
+            </w:r>
+          </w:p>
+          <w:p>
+            <w:pPr>
+              <w:widowControl w:val="0"/>
+              <w:autoSpaceDE w:val="0"/>
+              <w:autoSpaceDN w:val="0"/>
+              <w:adjustRightInd w:val="0"/>
+              <w:spacing w:line="240" w:lineRule="auto"/>
+              <w:rPr>
+                <w:rFonts w:ascii="BRH Malayalam Extra" w:hAnsi="BRH Malayalam Extra" w:cs="BRH Malayalam Extra"/>
+                <w:color w:val="000000"/>
+                <w:sz w:val="32"/>
+                <w:szCs w:val="40"/>
+              </w:rPr>
+            </w:pPr>
+            <w:r>
+              <w:rPr>
+                <w:rFonts w:ascii="BRH Malayalam Extra" w:hAnsi="BRH Malayalam Extra" w:cs="BRH Malayalam Extra"/>
+                <w:color w:val="000000"/>
+                <w:sz w:val="32"/>
+                <w:szCs w:val="40"/>
+              </w:rPr>
+              <w:t>D</w:t>
+            </w:r>
+            <w:r>
+              <w:rPr>
+                <w:rFonts w:ascii="BRH Malayalam Extra" w:hAnsi="BRH Malayalam Extra" w:cs="BRH Malayalam Extra"/>
+                <w:color w:val="000000"/>
+                <w:sz w:val="28"/>
+                <w:szCs w:val="40"/>
+              </w:rPr>
+              <w:t>–</w:t>
+            </w:r>
+            <w:r>
+              <w:rPr>
+                <w:rFonts w:ascii="BRH Malayalam Extra" w:hAnsi="BRH Malayalam Extra" w:cs="BRH Malayalam Extra"/>
+                <w:color w:val="000000"/>
+                <w:sz w:val="32"/>
+                <w:szCs w:val="40"/>
+              </w:rPr>
+              <w:t>ªpz P— ¥Px</w:t>
+            </w:r>
+            <w:r>
+              <w:rPr>
+                <w:rFonts w:ascii="BRH Malayalam Extra" w:hAnsi="BRH Malayalam Extra" w:cs="BRH Malayalam Extra"/>
+                <w:color w:val="000000"/>
+                <w:sz w:val="28"/>
+                <w:szCs w:val="40"/>
+              </w:rPr>
+              <w:t>–</w:t>
+            </w:r>
+            <w:r>
+              <w:rPr>
+                <w:rFonts w:ascii="BRH Malayalam Extra" w:hAnsi="BRH Malayalam Extra" w:cs="BRH Malayalam Extra"/>
+                <w:color w:val="000000"/>
+                <w:sz w:val="32"/>
+                <w:szCs w:val="40"/>
+              </w:rPr>
+              <w:t xml:space="preserve">ªpõ¡—ªpz </w:t>
+            </w:r>
+            <w:r>
+              <w:rPr>
+                <w:rFonts w:ascii="BRH Malayalam Extra" w:hAnsi="BRH Malayalam Extra" w:cs="BRH Malayalam Extra"/>
+                <w:color w:val="000000"/>
+                <w:sz w:val="32"/>
+                <w:szCs w:val="40"/>
+                <w:highlight w:val="yellow"/>
+              </w:rPr>
+              <w:t>Px</w:t>
+            </w:r>
+            <w:r>
+              <w:rPr>
+                <w:rFonts w:ascii="BRH Malayalam Extra" w:hAnsi="BRH Malayalam Extra" w:cs="BRH Malayalam Extra"/>
+                <w:color w:val="000000"/>
+                <w:sz w:val="32"/>
+                <w:szCs w:val="40"/>
+              </w:rPr>
+              <w:t>˜sõ</w:t>
+            </w:r>
+            <w:r>
+              <w:rPr>
+                <w:rFonts w:ascii="BRH Malayalam Extra" w:hAnsi="BRH Malayalam Extra" w:cs="BRH Malayalam Extra"/>
+                <w:color w:val="000000"/>
+                <w:sz w:val="32"/>
+                <w:szCs w:val="40"/>
+                <w:highlight w:val="yellow"/>
+              </w:rPr>
+              <w:t>sy</w:t>
+            </w:r>
+            <w:r>
+              <w:rPr>
+                <w:rFonts w:ascii="BRH Malayalam Extra" w:hAnsi="BRH Malayalam Extra" w:cs="BRH Malayalam Extra"/>
+                <w:color w:val="000000"/>
+                <w:sz w:val="32"/>
+                <w:szCs w:val="40"/>
+              </w:rPr>
+              <w:t xml:space="preserve"> </w:t>
+            </w:r>
+          </w:p>
+          <w:p>
+            <w:pPr>
+              <w:widowControl w:val="0"/>
+              <w:autoSpaceDE w:val="0"/>
+              <w:autoSpaceDN w:val="0"/>
+              <w:adjustRightInd w:val="0"/>
+              <w:spacing w:line="240" w:lineRule="auto"/>
+              <w:rPr>
+                <w:rFonts w:ascii="BRH Malayalam Extra" w:hAnsi="BRH Malayalam Extra" w:cs="BRH Malayalam Extra"/>
+                <w:color w:val="000000"/>
+                <w:sz w:val="32"/>
+                <w:szCs w:val="40"/>
+              </w:rPr>
+            </w:pPr>
+            <w:r>
+              <w:rPr>
+                <w:rFonts w:ascii="BRH Malayalam Extra" w:hAnsi="BRH Malayalam Extra" w:cs="BRH Malayalam Extra"/>
+                <w:color w:val="000000"/>
+                <w:sz w:val="32"/>
+                <w:szCs w:val="40"/>
+              </w:rPr>
+              <w:t>¥Px</w:t>
+            </w:r>
+            <w:r>
+              <w:rPr>
+                <w:rFonts w:ascii="BRH Malayalam Extra" w:hAnsi="BRH Malayalam Extra" w:cs="BRH Malayalam Extra"/>
+                <w:color w:val="000000"/>
+                <w:sz w:val="28"/>
+                <w:szCs w:val="40"/>
+              </w:rPr>
+              <w:t>–</w:t>
+            </w:r>
+            <w:r>
+              <w:rPr>
+                <w:rFonts w:ascii="BRH Malayalam Extra" w:hAnsi="BRH Malayalam Extra" w:cs="BRH Malayalam Extra"/>
+                <w:color w:val="000000"/>
+                <w:sz w:val="32"/>
+                <w:szCs w:val="40"/>
+              </w:rPr>
+              <w:t xml:space="preserve">ªpõ¡—ªpz </w:t>
+            </w:r>
+            <w:r>
+              <w:rPr>
+                <w:rFonts w:ascii="BRH Malayalam Extra" w:hAnsi="BRH Malayalam Extra" w:cs="BRH Malayalam Extra"/>
+                <w:color w:val="000000"/>
+                <w:sz w:val="32"/>
+                <w:szCs w:val="40"/>
+                <w:highlight w:val="yellow"/>
+              </w:rPr>
+              <w:t>Px—sy</w:t>
+            </w:r>
+            <w:r>
+              <w:rPr>
+                <w:rFonts w:ascii="BRH Malayalam Extra" w:hAnsi="BRH Malayalam Extra" w:cs="BRH Malayalam Extra"/>
+                <w:color w:val="000000"/>
+                <w:sz w:val="32"/>
+                <w:szCs w:val="40"/>
+              </w:rPr>
+              <w:t xml:space="preserve"> | </w:t>
+            </w:r>
+          </w:p>
+          <w:p>
+            <w:pPr>
+              <w:widowControl w:val="0"/>
+              <w:autoSpaceDE w:val="0"/>
+              <w:autoSpaceDN w:val="0"/>
+              <w:adjustRightInd w:val="0"/>
+              <w:spacing w:line="240" w:lineRule="auto"/>
+              <w:rPr>
+                <w:rFonts w:ascii="BRH Malayalam Extra" w:hAnsi="BRH Malayalam Extra" w:cs="BRH Malayalam Extra"/>
+                <w:color w:val="000000"/>
+                <w:sz w:val="32"/>
+                <w:szCs w:val="40"/>
+              </w:rPr>
+            </w:pPr>
+            <w:r>
+              <w:rPr>
+                <w:rFonts w:cs="BRH Malayalam Extra"/>
+                <w:color w:val="000000"/>
+                <w:szCs w:val="40"/>
+              </w:rPr>
+              <w:t>45</w:t>
+            </w:r>
+            <w:r>
+              <w:rPr>
+                <w:rFonts w:ascii="BRH Malayalam Extra" w:hAnsi="BRH Malayalam Extra" w:cs="BRH Malayalam Extra"/>
+                <w:color w:val="000000"/>
+                <w:sz w:val="32"/>
+                <w:szCs w:val="40"/>
+              </w:rPr>
+              <w:t>)</w:t>
+            </w:r>
+            <w:r>
+              <w:rPr>
+                <w:rFonts w:ascii="BRH Malayalam Extra" w:hAnsi="BRH Malayalam Extra" w:cs="BRH Malayalam Extra"/>
+                <w:color w:val="000000"/>
+                <w:sz w:val="32"/>
+                <w:szCs w:val="40"/>
+              </w:rPr>
+              <w:tab/>
+            </w:r>
+            <w:r>
+              <w:rPr>
+                <w:rFonts w:cs="BRH Malayalam Extra"/>
+                <w:color w:val="000000"/>
+                <w:szCs w:val="40"/>
+              </w:rPr>
+              <w:t>1</w:t>
+            </w:r>
+            <w:r>
+              <w:rPr>
+                <w:rFonts w:ascii="BRH Malayalam Extra" w:hAnsi="BRH Malayalam Extra" w:cs="BRH Malayalam Extra"/>
+                <w:color w:val="000000"/>
+                <w:sz w:val="32"/>
+                <w:szCs w:val="40"/>
+              </w:rPr>
+              <w:t>.</w:t>
+            </w:r>
+            <w:r>
+              <w:rPr>
+                <w:rFonts w:cs="BRH Malayalam Extra"/>
+                <w:color w:val="000000"/>
+                <w:szCs w:val="40"/>
+              </w:rPr>
+              <w:t>1</w:t>
+            </w:r>
+            <w:r>
+              <w:rPr>
+                <w:rFonts w:ascii="BRH Malayalam Extra" w:hAnsi="BRH Malayalam Extra" w:cs="BRH Malayalam Extra"/>
+                <w:color w:val="000000"/>
+                <w:sz w:val="32"/>
+                <w:szCs w:val="40"/>
+              </w:rPr>
+              <w:t>.</w:t>
+            </w:r>
+            <w:r>
+              <w:rPr>
+                <w:rFonts w:cs="BRH Malayalam Extra"/>
+                <w:color w:val="000000"/>
+                <w:szCs w:val="40"/>
+              </w:rPr>
+              <w:t>9</w:t>
+            </w:r>
+            <w:r>
+              <w:rPr>
+                <w:rFonts w:ascii="BRH Malayalam Extra" w:hAnsi="BRH Malayalam Extra" w:cs="BRH Malayalam Extra"/>
+                <w:color w:val="000000"/>
+                <w:sz w:val="32"/>
+                <w:szCs w:val="40"/>
+              </w:rPr>
+              <w:t>.</w:t>
+            </w:r>
+            <w:r>
+              <w:rPr>
+                <w:rFonts w:cs="BRH Malayalam Extra"/>
+                <w:color w:val="000000"/>
+                <w:szCs w:val="40"/>
+              </w:rPr>
+              <w:t>3</w:t>
+            </w:r>
+            <w:r>
+              <w:rPr>
+                <w:rFonts w:ascii="BRH Malayalam Extra" w:hAnsi="BRH Malayalam Extra" w:cs="BRH Malayalam Extra"/>
+                <w:color w:val="000000"/>
+                <w:sz w:val="32"/>
+                <w:szCs w:val="40"/>
+              </w:rPr>
+              <w:t>(</w:t>
+            </w:r>
+            <w:r>
+              <w:rPr>
+                <w:rFonts w:cs="BRH Malayalam Extra"/>
+                <w:color w:val="000000"/>
+                <w:szCs w:val="40"/>
+              </w:rPr>
+              <w:t>42</w:t>
+            </w:r>
+            <w:r>
+              <w:rPr>
+                <w:rFonts w:ascii="BRH Malayalam Extra" w:hAnsi="BRH Malayalam Extra" w:cs="BRH Malayalam Extra"/>
+                <w:color w:val="000000"/>
+                <w:sz w:val="32"/>
+                <w:szCs w:val="40"/>
+              </w:rPr>
+              <w:t>)- P</w:t>
+            </w:r>
+            <w:r>
+              <w:rPr>
+                <w:rFonts w:ascii="BRH Malayalam Extra" w:hAnsi="BRH Malayalam Extra" w:cs="BRH Malayalam Extra"/>
+                <w:color w:val="000000"/>
+                <w:sz w:val="28"/>
+                <w:szCs w:val="40"/>
+              </w:rPr>
+              <w:t>–</w:t>
+            </w:r>
+            <w:r>
+              <w:rPr>
+                <w:rFonts w:ascii="BRH Malayalam Extra" w:hAnsi="BRH Malayalam Extra" w:cs="BRH Malayalam Extra"/>
+                <w:color w:val="000000"/>
+                <w:sz w:val="32"/>
+                <w:szCs w:val="40"/>
+              </w:rPr>
+              <w:t xml:space="preserve"> | </w:t>
+            </w:r>
+            <w:r>
+              <w:rPr>
+                <w:rFonts w:ascii="BRH Malayalam Extra" w:hAnsi="BRH Malayalam Extra" w:cs="BRH Malayalam Extra"/>
+                <w:color w:val="000000"/>
+                <w:sz w:val="32"/>
+                <w:szCs w:val="40"/>
+                <w:highlight w:val="yellow"/>
+              </w:rPr>
+              <w:t>A</w:t>
+            </w:r>
+            <w:r>
+              <w:rPr>
+                <w:rFonts w:ascii="BRH Malayalam Extra" w:hAnsi="BRH Malayalam Extra" w:cs="BRH Malayalam Extra"/>
+                <w:color w:val="000000"/>
+                <w:sz w:val="28"/>
+                <w:szCs w:val="40"/>
+                <w:highlight w:val="yellow"/>
+              </w:rPr>
+              <w:t>–</w:t>
+            </w:r>
+            <w:r>
+              <w:rPr>
+                <w:rFonts w:ascii="BRH Malayalam Extra" w:hAnsi="BRH Malayalam Extra" w:cs="BRH Malayalam Extra"/>
+                <w:color w:val="000000"/>
+                <w:sz w:val="32"/>
+                <w:szCs w:val="40"/>
+                <w:highlight w:val="yellow"/>
+              </w:rPr>
+              <w:t>sy</w:t>
+            </w:r>
+            <w:r>
+              <w:rPr>
+                <w:rFonts w:ascii="BRH Malayalam Extra" w:hAnsi="BRH Malayalam Extra" w:cs="BRH Malayalam Extra"/>
+                <w:color w:val="000000"/>
+                <w:sz w:val="28"/>
+                <w:szCs w:val="40"/>
+              </w:rPr>
+              <w:t>–</w:t>
+            </w:r>
+            <w:r>
+              <w:rPr>
+                <w:rFonts w:ascii="BRH Malayalam Extra" w:hAnsi="BRH Malayalam Extra" w:cs="BRH Malayalam Extra"/>
+                <w:color w:val="000000"/>
+                <w:sz w:val="32"/>
+                <w:szCs w:val="40"/>
+              </w:rPr>
+              <w:t xml:space="preserve"> | psûz˜ |</w:t>
+            </w:r>
+          </w:p>
+          <w:p>
+            <w:pPr>
+              <w:widowControl w:val="0"/>
+              <w:autoSpaceDE w:val="0"/>
+              <w:autoSpaceDN w:val="0"/>
+              <w:adjustRightInd w:val="0"/>
+              <w:spacing w:line="240" w:lineRule="auto"/>
+              <w:rPr>
+                <w:rFonts w:ascii="BRH Malayalam Extra" w:hAnsi="BRH Malayalam Extra" w:cs="BRH Malayalam Extra"/>
+                <w:color w:val="000000"/>
+                <w:sz w:val="32"/>
+                <w:szCs w:val="40"/>
+              </w:rPr>
+            </w:pPr>
+            <w:r>
+              <w:rPr>
+                <w:rFonts w:ascii="BRH Malayalam Extra" w:hAnsi="BRH Malayalam Extra" w:cs="BRH Malayalam Extra"/>
+                <w:color w:val="000000"/>
+                <w:sz w:val="32"/>
+                <w:szCs w:val="40"/>
+                <w:highlight w:val="yellow"/>
+              </w:rPr>
+              <w:t>Px</w:t>
+            </w:r>
+            <w:r>
+              <w:rPr>
+                <w:rFonts w:ascii="BRH Malayalam Extra" w:hAnsi="BRH Malayalam Extra" w:cs="BRH Malayalam Extra"/>
+                <w:color w:val="000000"/>
+                <w:sz w:val="28"/>
+                <w:szCs w:val="40"/>
+                <w:highlight w:val="yellow"/>
+              </w:rPr>
+              <w:t>–</w:t>
+            </w:r>
+            <w:r>
+              <w:rPr>
+                <w:rFonts w:ascii="BRH Malayalam Extra" w:hAnsi="BRH Malayalam Extra" w:cs="BRH Malayalam Extra"/>
+                <w:color w:val="000000"/>
+                <w:sz w:val="32"/>
+                <w:szCs w:val="40"/>
+                <w:highlight w:val="yellow"/>
+              </w:rPr>
+              <w:t>sõ</w:t>
+            </w:r>
+            <w:r>
+              <w:rPr>
+                <w:rFonts w:ascii="BRH Malayalam Extra" w:hAnsi="BRH Malayalam Extra" w:cs="BRH Malayalam Extra"/>
+                <w:color w:val="000000"/>
+                <w:sz w:val="28"/>
+                <w:szCs w:val="40"/>
+                <w:highlight w:val="yellow"/>
+              </w:rPr>
+              <w:t>–</w:t>
+            </w:r>
+            <w:r>
+              <w:rPr>
+                <w:rFonts w:ascii="BRH Malayalam Extra" w:hAnsi="BRH Malayalam Extra" w:cs="BRH Malayalam Extra"/>
+                <w:color w:val="000000"/>
+                <w:sz w:val="32"/>
+                <w:szCs w:val="40"/>
+                <w:highlight w:val="yellow"/>
+              </w:rPr>
+              <w:t>sy</w:t>
+            </w:r>
+            <w:r>
+              <w:rPr>
+                <w:rFonts w:ascii="BRH Malayalam Extra" w:hAnsi="BRH Malayalam Extra" w:cs="BRH Malayalam Extra"/>
+                <w:color w:val="000000"/>
+                <w:sz w:val="28"/>
+                <w:szCs w:val="40"/>
+              </w:rPr>
+              <w:t>–</w:t>
+            </w:r>
+            <w:r>
+              <w:rPr>
+                <w:rFonts w:ascii="BRH Malayalam Extra" w:hAnsi="BRH Malayalam Extra" w:cs="BRH Malayalam Extra"/>
+                <w:color w:val="000000"/>
+                <w:sz w:val="32"/>
+                <w:szCs w:val="40"/>
+              </w:rPr>
+              <w:t xml:space="preserve"> P</w:t>
+            </w:r>
+            <w:r>
+              <w:rPr>
+                <w:rFonts w:ascii="BRH Malayalam Extra" w:hAnsi="BRH Malayalam Extra" w:cs="BRH Malayalam Extra"/>
+                <w:color w:val="000000"/>
+                <w:sz w:val="28"/>
+                <w:szCs w:val="40"/>
+              </w:rPr>
+              <w:t>–</w:t>
+            </w:r>
+            <w:r>
+              <w:rPr>
+                <w:rFonts w:ascii="BRH Malayalam Extra" w:hAnsi="BRH Malayalam Extra" w:cs="BRH Malayalam Extra"/>
+                <w:color w:val="000000"/>
+                <w:sz w:val="32"/>
+                <w:szCs w:val="40"/>
+              </w:rPr>
+              <w:t xml:space="preserve"> </w:t>
+            </w:r>
+            <w:r>
+              <w:rPr>
+                <w:rFonts w:ascii="BRH Malayalam Extra" w:hAnsi="BRH Malayalam Extra" w:cs="BRH Malayalam Extra"/>
+                <w:color w:val="000000"/>
+                <w:sz w:val="32"/>
+                <w:szCs w:val="40"/>
+                <w:highlight w:val="yellow"/>
+              </w:rPr>
+              <w:t>Px</w:t>
+            </w:r>
+            <w:r>
+              <w:rPr>
+                <w:rFonts w:ascii="BRH Malayalam Extra" w:hAnsi="BRH Malayalam Extra" w:cs="BRH Malayalam Extra"/>
+                <w:color w:val="000000"/>
+                <w:sz w:val="28"/>
+                <w:szCs w:val="40"/>
+              </w:rPr>
+              <w:t>–</w:t>
+            </w:r>
+            <w:r>
+              <w:rPr>
+                <w:rFonts w:ascii="BRH Malayalam Extra" w:hAnsi="BRH Malayalam Extra" w:cs="BRH Malayalam Extra"/>
+                <w:color w:val="000000"/>
+                <w:sz w:val="32"/>
+                <w:szCs w:val="40"/>
+              </w:rPr>
+              <w:t>sy</w:t>
+            </w:r>
+            <w:r>
+              <w:rPr>
+                <w:rFonts w:ascii="BRH Malayalam Extra" w:hAnsi="BRH Malayalam Extra" w:cs="BRH Malayalam Extra"/>
+                <w:color w:val="000000"/>
+                <w:sz w:val="28"/>
+                <w:szCs w:val="40"/>
+              </w:rPr>
+              <w:t>–</w:t>
+            </w:r>
+            <w:r>
+              <w:rPr>
+                <w:rFonts w:ascii="BRH Malayalam Extra" w:hAnsi="BRH Malayalam Extra" w:cs="BRH Malayalam Extra"/>
+                <w:color w:val="000000"/>
+                <w:sz w:val="32"/>
+                <w:szCs w:val="40"/>
+              </w:rPr>
+              <w:t xml:space="preserve"> psûz</w:t>
+            </w:r>
+            <w:r>
+              <w:rPr>
+                <w:rFonts w:ascii="BRH Malayalam Extra" w:hAnsi="BRH Malayalam Extra" w:cs="BRH Malayalam Extra"/>
+                <w:color w:val="000000"/>
+                <w:sz w:val="28"/>
+                <w:szCs w:val="40"/>
+              </w:rPr>
+              <w:t>–</w:t>
+            </w:r>
+            <w:r>
+              <w:rPr>
+                <w:rFonts w:ascii="BRH Malayalam Extra" w:hAnsi="BRH Malayalam Extra" w:cs="BRH Malayalam Extra"/>
+                <w:color w:val="000000"/>
+                <w:sz w:val="32"/>
+                <w:szCs w:val="40"/>
+              </w:rPr>
+              <w:t xml:space="preserve"> p</w:t>
+            </w:r>
+            <w:r>
+              <w:rPr>
+                <w:rFonts w:ascii="BRH Malayalam Extra" w:hAnsi="BRH Malayalam Extra" w:cs="BRH Malayalam Extra"/>
+                <w:color w:val="000000"/>
+                <w:sz w:val="32"/>
+                <w:szCs w:val="40"/>
+                <w:highlight w:val="yellow"/>
+              </w:rPr>
+              <w:t>sûõ—sy</w:t>
+            </w:r>
+            <w:r>
+              <w:rPr>
+                <w:rFonts w:ascii="BRH Malayalam Extra" w:hAnsi="BRH Malayalam Extra" w:cs="BRH Malayalam Extra"/>
+                <w:color w:val="000000"/>
+                <w:sz w:val="32"/>
+                <w:szCs w:val="40"/>
+              </w:rPr>
+              <w:t xml:space="preserve"> </w:t>
+            </w:r>
+            <w:r>
+              <w:rPr>
+                <w:rFonts w:ascii="BRH Malayalam Extra" w:hAnsi="BRH Malayalam Extra" w:cs="BRH Malayalam Extra"/>
+                <w:color w:val="000000"/>
+                <w:sz w:val="32"/>
+                <w:szCs w:val="40"/>
+                <w:highlight w:val="yellow"/>
+              </w:rPr>
+              <w:t>P</w:t>
+            </w:r>
+            <w:r>
+              <w:rPr>
+                <w:rFonts w:ascii="BRH Malayalam Extra" w:hAnsi="BRH Malayalam Extra" w:cs="BRH Malayalam Extra"/>
+                <w:color w:val="000000"/>
+                <w:sz w:val="32"/>
+                <w:szCs w:val="40"/>
+              </w:rPr>
+              <w:t xml:space="preserve"> Pxsy</w:t>
+            </w:r>
+            <w:r>
+              <w:rPr>
+                <w:rFonts w:ascii="BRH Malayalam Extra" w:hAnsi="BRH Malayalam Extra" w:cs="BRH Malayalam Extra"/>
+                <w:color w:val="000000"/>
+                <w:sz w:val="28"/>
+                <w:szCs w:val="40"/>
+              </w:rPr>
+              <w:t>–</w:t>
+            </w:r>
+            <w:r>
+              <w:rPr>
+                <w:rFonts w:ascii="BRH Malayalam Extra" w:hAnsi="BRH Malayalam Extra" w:cs="BRH Malayalam Extra"/>
+                <w:color w:val="000000"/>
+                <w:sz w:val="32"/>
+                <w:szCs w:val="40"/>
+              </w:rPr>
+              <w:t xml:space="preserve"> psûz˜ | </w:t>
+            </w:r>
+          </w:p>
+          <w:p>
+            <w:pPr>
+              <w:widowControl w:val="0"/>
+              <w:autoSpaceDE w:val="0"/>
+              <w:autoSpaceDN w:val="0"/>
+              <w:adjustRightInd w:val="0"/>
+              <w:spacing w:line="240" w:lineRule="auto"/>
+              <w:rPr>
+                <w:rFonts w:ascii="BRH Malayalam Extra" w:hAnsi="BRH Malayalam Extra" w:cs="BRH Malayalam Extra"/>
+                <w:color w:val="000000"/>
+                <w:sz w:val="32"/>
+                <w:szCs w:val="40"/>
+              </w:rPr>
+            </w:pPr>
+            <w:r>
+              <w:rPr>
+                <w:rFonts w:cs="BRH Malayalam Extra"/>
+                <w:color w:val="000000"/>
+                <w:szCs w:val="40"/>
+              </w:rPr>
+              <w:t>46</w:t>
+            </w:r>
+            <w:r>
+              <w:rPr>
+                <w:rFonts w:ascii="BRH Malayalam Extra" w:hAnsi="BRH Malayalam Extra" w:cs="BRH Malayalam Extra"/>
+                <w:color w:val="000000"/>
+                <w:sz w:val="32"/>
+                <w:szCs w:val="40"/>
+              </w:rPr>
+              <w:t>)</w:t>
+            </w:r>
+            <w:r>
+              <w:rPr>
+                <w:rFonts w:ascii="BRH Malayalam Extra" w:hAnsi="BRH Malayalam Extra" w:cs="BRH Malayalam Extra"/>
+                <w:color w:val="000000"/>
+                <w:sz w:val="32"/>
+                <w:szCs w:val="40"/>
+              </w:rPr>
+              <w:tab/>
+            </w:r>
+            <w:r>
+              <w:rPr>
+                <w:rFonts w:cs="BRH Malayalam Extra"/>
+                <w:color w:val="000000"/>
+                <w:szCs w:val="40"/>
+              </w:rPr>
+              <w:t>1</w:t>
+            </w:r>
+            <w:r>
+              <w:rPr>
+                <w:rFonts w:ascii="BRH Malayalam Extra" w:hAnsi="BRH Malayalam Extra" w:cs="BRH Malayalam Extra"/>
+                <w:color w:val="000000"/>
+                <w:sz w:val="32"/>
+                <w:szCs w:val="40"/>
+              </w:rPr>
+              <w:t>.</w:t>
+            </w:r>
+            <w:r>
+              <w:rPr>
+                <w:rFonts w:cs="BRH Malayalam Extra"/>
+                <w:color w:val="000000"/>
+                <w:szCs w:val="40"/>
+              </w:rPr>
+              <w:t>1</w:t>
+            </w:r>
+            <w:r>
+              <w:rPr>
+                <w:rFonts w:ascii="BRH Malayalam Extra" w:hAnsi="BRH Malayalam Extra" w:cs="BRH Malayalam Extra"/>
+                <w:color w:val="000000"/>
+                <w:sz w:val="32"/>
+                <w:szCs w:val="40"/>
+              </w:rPr>
+              <w:t>.</w:t>
+            </w:r>
+            <w:r>
+              <w:rPr>
+                <w:rFonts w:cs="BRH Malayalam Extra"/>
+                <w:color w:val="000000"/>
+                <w:szCs w:val="40"/>
+              </w:rPr>
+              <w:t>9</w:t>
+            </w:r>
+            <w:r>
+              <w:rPr>
+                <w:rFonts w:ascii="BRH Malayalam Extra" w:hAnsi="BRH Malayalam Extra" w:cs="BRH Malayalam Extra"/>
+                <w:color w:val="000000"/>
+                <w:sz w:val="32"/>
+                <w:szCs w:val="40"/>
+              </w:rPr>
+              <w:t>.</w:t>
+            </w:r>
+            <w:r>
+              <w:rPr>
+                <w:rFonts w:cs="BRH Malayalam Extra"/>
+                <w:color w:val="000000"/>
+                <w:szCs w:val="40"/>
+              </w:rPr>
+              <w:t>3</w:t>
+            </w:r>
+            <w:r>
+              <w:rPr>
+                <w:rFonts w:ascii="BRH Malayalam Extra" w:hAnsi="BRH Malayalam Extra" w:cs="BRH Malayalam Extra"/>
+                <w:color w:val="000000"/>
+                <w:sz w:val="32"/>
+                <w:szCs w:val="40"/>
+              </w:rPr>
+              <w:t>(</w:t>
+            </w:r>
+            <w:r>
+              <w:rPr>
+                <w:rFonts w:cs="BRH Malayalam Extra"/>
+                <w:color w:val="000000"/>
+                <w:szCs w:val="40"/>
+              </w:rPr>
+              <w:t>43</w:t>
+            </w:r>
+            <w:r>
+              <w:rPr>
+                <w:rFonts w:ascii="BRH Malayalam Extra" w:hAnsi="BRH Malayalam Extra" w:cs="BRH Malayalam Extra"/>
+                <w:color w:val="000000"/>
+                <w:sz w:val="32"/>
+                <w:szCs w:val="40"/>
+              </w:rPr>
+              <w:t xml:space="preserve">)- </w:t>
+            </w:r>
+            <w:r>
+              <w:rPr>
+                <w:rFonts w:ascii="BRH Malayalam Extra" w:hAnsi="BRH Malayalam Extra" w:cs="BRH Malayalam Extra"/>
+                <w:color w:val="000000"/>
+                <w:sz w:val="32"/>
+                <w:szCs w:val="40"/>
+                <w:highlight w:val="yellow"/>
+              </w:rPr>
+              <w:t>A</w:t>
+            </w:r>
+            <w:r>
+              <w:rPr>
+                <w:rFonts w:ascii="BRH Malayalam Extra" w:hAnsi="BRH Malayalam Extra" w:cs="BRH Malayalam Extra"/>
+                <w:color w:val="000000"/>
+                <w:sz w:val="28"/>
+                <w:szCs w:val="40"/>
+                <w:highlight w:val="yellow"/>
+              </w:rPr>
+              <w:t>–</w:t>
+            </w:r>
+            <w:r>
+              <w:rPr>
+                <w:rFonts w:ascii="BRH Malayalam Extra" w:hAnsi="BRH Malayalam Extra" w:cs="BRH Malayalam Extra"/>
+                <w:color w:val="000000"/>
+                <w:sz w:val="32"/>
+                <w:szCs w:val="40"/>
+                <w:highlight w:val="yellow"/>
+              </w:rPr>
+              <w:t>sy</w:t>
+            </w:r>
+            <w:r>
+              <w:rPr>
+                <w:rFonts w:ascii="BRH Malayalam Extra" w:hAnsi="BRH Malayalam Extra" w:cs="BRH Malayalam Extra"/>
+                <w:color w:val="000000"/>
+                <w:sz w:val="28"/>
+                <w:szCs w:val="40"/>
+              </w:rPr>
+              <w:t>–</w:t>
+            </w:r>
+            <w:r>
+              <w:rPr>
+                <w:rFonts w:ascii="BRH Malayalam Extra" w:hAnsi="BRH Malayalam Extra" w:cs="BRH Malayalam Extra"/>
+                <w:color w:val="000000"/>
+                <w:sz w:val="32"/>
+                <w:szCs w:val="40"/>
+              </w:rPr>
+              <w:t xml:space="preserve"> | psûz˜ | P</w:t>
+            </w:r>
+            <w:r>
+              <w:rPr>
+                <w:rFonts w:ascii="BRH Malayalam Extra" w:hAnsi="BRH Malayalam Extra" w:cs="BRH Malayalam Extra"/>
+                <w:color w:val="000000"/>
+                <w:sz w:val="28"/>
+                <w:szCs w:val="40"/>
+              </w:rPr>
+              <w:t>–</w:t>
+            </w:r>
+            <w:r>
+              <w:rPr>
+                <w:rFonts w:ascii="BRH Malayalam Extra" w:hAnsi="BRH Malayalam Extra" w:cs="BRH Malayalam Extra"/>
+                <w:color w:val="000000"/>
+                <w:sz w:val="32"/>
+                <w:szCs w:val="40"/>
+              </w:rPr>
+              <w:t xml:space="preserve"> |</w:t>
+            </w:r>
+          </w:p>
+          <w:p>
+            <w:pPr>
+              <w:widowControl w:val="0"/>
+              <w:autoSpaceDE w:val="0"/>
+              <w:autoSpaceDN w:val="0"/>
+              <w:adjustRightInd w:val="0"/>
+              <w:spacing w:line="240" w:lineRule="auto"/>
+              <w:rPr>
+                <w:rFonts w:ascii="BRH Malayalam Extra" w:hAnsi="BRH Malayalam Extra" w:cs="BRH Malayalam Extra"/>
+                <w:color w:val="000000"/>
+                <w:sz w:val="32"/>
+                <w:szCs w:val="40"/>
+              </w:rPr>
+            </w:pPr>
+            <w:r>
+              <w:rPr>
+                <w:rFonts w:ascii="BRH Malayalam Extra" w:hAnsi="BRH Malayalam Extra" w:cs="BRH Malayalam Extra"/>
+                <w:color w:val="000000"/>
+                <w:sz w:val="32"/>
+                <w:szCs w:val="40"/>
+                <w:highlight w:val="yellow"/>
+              </w:rPr>
+              <w:t>A</w:t>
+            </w:r>
+            <w:r>
+              <w:rPr>
+                <w:rFonts w:ascii="BRH Malayalam Extra" w:hAnsi="BRH Malayalam Extra" w:cs="BRH Malayalam Extra"/>
+                <w:color w:val="000000"/>
+                <w:sz w:val="28"/>
+                <w:szCs w:val="40"/>
+              </w:rPr>
+              <w:t>–</w:t>
+            </w:r>
+            <w:r>
+              <w:rPr>
+                <w:rFonts w:ascii="BRH Malayalam Extra" w:hAnsi="BRH Malayalam Extra" w:cs="BRH Malayalam Extra"/>
+                <w:color w:val="000000"/>
+                <w:sz w:val="32"/>
+                <w:szCs w:val="40"/>
+              </w:rPr>
+              <w:t>sy</w:t>
+            </w:r>
+            <w:r>
+              <w:rPr>
+                <w:rFonts w:ascii="BRH Malayalam Extra" w:hAnsi="BRH Malayalam Extra" w:cs="BRH Malayalam Extra"/>
+                <w:color w:val="000000"/>
+                <w:sz w:val="28"/>
+                <w:szCs w:val="40"/>
+              </w:rPr>
+              <w:t>–</w:t>
+            </w:r>
+            <w:r>
+              <w:rPr>
+                <w:rFonts w:ascii="BRH Malayalam Extra" w:hAnsi="BRH Malayalam Extra" w:cs="BRH Malayalam Extra"/>
+                <w:color w:val="000000"/>
+                <w:sz w:val="32"/>
+                <w:szCs w:val="40"/>
+              </w:rPr>
+              <w:t xml:space="preserve"> psûz</w:t>
+            </w:r>
+            <w:r>
+              <w:rPr>
+                <w:rFonts w:ascii="BRH Malayalam Extra" w:hAnsi="BRH Malayalam Extra" w:cs="BRH Malayalam Extra"/>
+                <w:color w:val="000000"/>
+                <w:sz w:val="28"/>
+                <w:szCs w:val="40"/>
+              </w:rPr>
+              <w:t>–</w:t>
+            </w:r>
+            <w:r>
+              <w:rPr>
+                <w:rFonts w:ascii="BRH Malayalam Extra" w:hAnsi="BRH Malayalam Extra" w:cs="BRH Malayalam Extra"/>
+                <w:color w:val="000000"/>
+                <w:sz w:val="32"/>
+                <w:szCs w:val="40"/>
+              </w:rPr>
+              <w:t xml:space="preserve"> p</w:t>
+            </w:r>
+            <w:r>
+              <w:rPr>
+                <w:rFonts w:ascii="BRH Malayalam Extra" w:hAnsi="BRH Malayalam Extra" w:cs="BRH Malayalam Extra"/>
+                <w:color w:val="000000"/>
+                <w:sz w:val="32"/>
+                <w:szCs w:val="40"/>
+                <w:highlight w:val="yellow"/>
+              </w:rPr>
+              <w:t>sûõ</w:t>
+            </w:r>
+            <w:r>
+              <w:rPr>
+                <w:rFonts w:ascii="BRH Malayalam Extra" w:hAnsi="BRH Malayalam Extra" w:cs="BRH Malayalam Extra"/>
+                <w:color w:val="000000"/>
+                <w:sz w:val="32"/>
+                <w:szCs w:val="40"/>
+              </w:rPr>
+              <w:t>—sõsy</w:t>
+            </w:r>
+            <w:r>
+              <w:rPr>
+                <w:rFonts w:ascii="BRH Malayalam Extra" w:hAnsi="BRH Malayalam Extra" w:cs="BRH Malayalam Extra"/>
+                <w:color w:val="000000"/>
+                <w:sz w:val="28"/>
+                <w:szCs w:val="40"/>
+              </w:rPr>
+              <w:t>–</w:t>
+            </w:r>
+            <w:r>
+              <w:rPr>
+                <w:rFonts w:ascii="BRH Malayalam Extra" w:hAnsi="BRH Malayalam Extra" w:cs="BRH Malayalam Extra"/>
+                <w:color w:val="000000"/>
+                <w:sz w:val="32"/>
+                <w:szCs w:val="40"/>
+              </w:rPr>
+              <w:t xml:space="preserve"> psûz— P </w:t>
+            </w:r>
+          </w:p>
+          <w:p>
+            <w:pPr>
+              <w:widowControl w:val="0"/>
+              <w:autoSpaceDE w:val="0"/>
+              <w:autoSpaceDN w:val="0"/>
+              <w:adjustRightInd w:val="0"/>
+              <w:spacing w:line="240" w:lineRule="auto"/>
+              <w:rPr>
+                <w:rFonts w:ascii="BRH Malayalam Extra" w:hAnsi="BRH Malayalam Extra" w:cs="BRH Malayalam Extra"/>
+                <w:sz w:val="28"/>
+                <w:szCs w:val="36"/>
+              </w:rPr>
+            </w:pPr>
+            <w:r>
+              <w:rPr>
+                <w:rFonts w:ascii="BRH Malayalam Extra" w:hAnsi="BRH Malayalam Extra" w:cs="BRH Malayalam Extra"/>
+                <w:color w:val="000000"/>
+                <w:sz w:val="32"/>
+                <w:szCs w:val="40"/>
+              </w:rPr>
+              <w:t>P</w:t>
+            </w:r>
+            <w:r>
+              <w:rPr>
+                <w:rFonts w:ascii="BRH Malayalam Extra" w:hAnsi="BRH Malayalam Extra" w:cs="BRH Malayalam Extra"/>
+                <w:color w:val="000000"/>
+                <w:sz w:val="28"/>
+                <w:szCs w:val="40"/>
+              </w:rPr>
+              <w:t>–</w:t>
+            </w:r>
+            <w:r>
+              <w:rPr>
+                <w:rFonts w:ascii="BRH Malayalam Extra" w:hAnsi="BRH Malayalam Extra" w:cs="BRH Malayalam Extra"/>
+                <w:color w:val="000000"/>
+                <w:sz w:val="32"/>
+                <w:szCs w:val="40"/>
+              </w:rPr>
+              <w:t xml:space="preserve"> p</w:t>
+            </w:r>
+            <w:r>
+              <w:rPr>
+                <w:rFonts w:ascii="BRH Malayalam Extra" w:hAnsi="BRH Malayalam Extra" w:cs="BRH Malayalam Extra"/>
+                <w:color w:val="000000"/>
+                <w:sz w:val="32"/>
+                <w:szCs w:val="40"/>
+                <w:highlight w:val="yellow"/>
+              </w:rPr>
+              <w:t>sûõ</w:t>
+            </w:r>
+            <w:r>
+              <w:rPr>
+                <w:rFonts w:ascii="BRH Malayalam Extra" w:hAnsi="BRH Malayalam Extra" w:cs="BRH Malayalam Extra"/>
+                <w:color w:val="000000"/>
+                <w:sz w:val="32"/>
+                <w:szCs w:val="40"/>
+              </w:rPr>
+              <w:t>—sõsy</w:t>
+            </w:r>
+            <w:r>
+              <w:rPr>
+                <w:rFonts w:ascii="BRH Malayalam Extra" w:hAnsi="BRH Malayalam Extra" w:cs="BRH Malayalam Extra"/>
+                <w:color w:val="000000"/>
+                <w:sz w:val="28"/>
+                <w:szCs w:val="40"/>
+              </w:rPr>
+              <w:t>–</w:t>
+            </w:r>
+            <w:r>
+              <w:rPr>
+                <w:rFonts w:ascii="BRH Malayalam Extra" w:hAnsi="BRH Malayalam Extra" w:cs="BRH Malayalam Extra"/>
+                <w:color w:val="000000"/>
+                <w:sz w:val="32"/>
+                <w:szCs w:val="40"/>
+              </w:rPr>
+              <w:t xml:space="preserve"> psûz— P | </w:t>
+            </w:r>
+          </w:p>
+        </w:tc>
+        <w:tc>
+          <w:tcPr>
+            <w:tcW w:w="7513" w:type="dxa"/>
+          </w:tcPr>
+          <w:p>
+            <w:pPr>
+              <w:widowControl w:val="0"/>
+              <w:autoSpaceDE w:val="0"/>
+              <w:autoSpaceDN w:val="0"/>
+              <w:adjustRightInd w:val="0"/>
+              <w:spacing w:line="240" w:lineRule="auto"/>
+              <w:rPr>
+                <w:rFonts w:ascii="BRH Malayalam Extra" w:hAnsi="BRH Malayalam Extra" w:cs="BRH Malayalam Extra"/>
+                <w:color w:val="000000"/>
+                <w:sz w:val="32"/>
+                <w:szCs w:val="40"/>
+              </w:rPr>
+            </w:pPr>
+            <w:r>
+              <w:rPr>
+                <w:rFonts w:cs="BRH Malayalam Extra"/>
+                <w:color w:val="000000"/>
+                <w:szCs w:val="40"/>
+              </w:rPr>
+              <w:t>44</w:t>
+            </w:r>
+            <w:r>
+              <w:rPr>
+                <w:rFonts w:ascii="BRH Malayalam Extra" w:hAnsi="BRH Malayalam Extra" w:cs="BRH Malayalam Extra"/>
+                <w:color w:val="000000"/>
+                <w:sz w:val="32"/>
+                <w:szCs w:val="40"/>
+              </w:rPr>
+              <w:t>)</w:t>
+            </w:r>
+            <w:r>
+              <w:rPr>
+                <w:rFonts w:ascii="BRH Malayalam Extra" w:hAnsi="BRH Malayalam Extra" w:cs="BRH Malayalam Extra"/>
+                <w:color w:val="000000"/>
+                <w:sz w:val="32"/>
+                <w:szCs w:val="40"/>
+              </w:rPr>
+              <w:tab/>
+            </w:r>
+            <w:r>
+              <w:rPr>
+                <w:rFonts w:cs="BRH Malayalam Extra"/>
+                <w:color w:val="000000"/>
+                <w:szCs w:val="40"/>
+              </w:rPr>
+              <w:t>1</w:t>
+            </w:r>
+            <w:r>
+              <w:rPr>
+                <w:rFonts w:ascii="BRH Malayalam Extra" w:hAnsi="BRH Malayalam Extra" w:cs="BRH Malayalam Extra"/>
+                <w:color w:val="000000"/>
+                <w:sz w:val="32"/>
+                <w:szCs w:val="40"/>
+              </w:rPr>
+              <w:t>.</w:t>
+            </w:r>
+            <w:r>
+              <w:rPr>
+                <w:rFonts w:cs="BRH Malayalam Extra"/>
+                <w:color w:val="000000"/>
+                <w:szCs w:val="40"/>
+              </w:rPr>
+              <w:t>1</w:t>
+            </w:r>
+            <w:r>
+              <w:rPr>
+                <w:rFonts w:ascii="BRH Malayalam Extra" w:hAnsi="BRH Malayalam Extra" w:cs="BRH Malayalam Extra"/>
+                <w:color w:val="000000"/>
+                <w:sz w:val="32"/>
+                <w:szCs w:val="40"/>
+              </w:rPr>
+              <w:t>.</w:t>
+            </w:r>
+            <w:r>
+              <w:rPr>
+                <w:rFonts w:cs="BRH Malayalam Extra"/>
+                <w:color w:val="000000"/>
+                <w:szCs w:val="40"/>
+              </w:rPr>
+              <w:t>9</w:t>
+            </w:r>
+            <w:r>
+              <w:rPr>
+                <w:rFonts w:ascii="BRH Malayalam Extra" w:hAnsi="BRH Malayalam Extra" w:cs="BRH Malayalam Extra"/>
+                <w:color w:val="000000"/>
+                <w:sz w:val="32"/>
+                <w:szCs w:val="40"/>
+              </w:rPr>
+              <w:t>.</w:t>
+            </w:r>
+            <w:r>
+              <w:rPr>
+                <w:rFonts w:cs="BRH Malayalam Extra"/>
+                <w:color w:val="000000"/>
+                <w:szCs w:val="40"/>
+              </w:rPr>
+              <w:t>3</w:t>
+            </w:r>
+            <w:r>
+              <w:rPr>
+                <w:rFonts w:ascii="BRH Malayalam Extra" w:hAnsi="BRH Malayalam Extra" w:cs="BRH Malayalam Extra"/>
+                <w:color w:val="000000"/>
+                <w:sz w:val="32"/>
+                <w:szCs w:val="40"/>
+              </w:rPr>
+              <w:t>(</w:t>
+            </w:r>
+            <w:r>
+              <w:rPr>
+                <w:rFonts w:cs="BRH Malayalam Extra"/>
+                <w:color w:val="000000"/>
+                <w:szCs w:val="40"/>
+              </w:rPr>
+              <w:t>41</w:t>
+            </w:r>
+            <w:r>
+              <w:rPr>
+                <w:rFonts w:ascii="BRH Malayalam Extra" w:hAnsi="BRH Malayalam Extra" w:cs="BRH Malayalam Extra"/>
+                <w:color w:val="000000"/>
+                <w:sz w:val="32"/>
+                <w:szCs w:val="40"/>
+              </w:rPr>
+              <w:t>)- D</w:t>
+            </w:r>
+            <w:r>
+              <w:rPr>
+                <w:rFonts w:ascii="BRH Malayalam Extra" w:hAnsi="BRH Malayalam Extra" w:cs="BRH Malayalam Extra"/>
+                <w:color w:val="000000"/>
+                <w:sz w:val="28"/>
+                <w:szCs w:val="40"/>
+              </w:rPr>
+              <w:t>–</w:t>
+            </w:r>
+            <w:r>
+              <w:rPr>
+                <w:rFonts w:ascii="BRH Malayalam Extra" w:hAnsi="BRH Malayalam Extra" w:cs="BRH Malayalam Extra"/>
+                <w:color w:val="000000"/>
+                <w:sz w:val="32"/>
+                <w:szCs w:val="40"/>
+              </w:rPr>
+              <w:t>ªpz | P</w:t>
+            </w:r>
+            <w:r>
+              <w:rPr>
+                <w:rFonts w:ascii="BRH Malayalam Extra" w:hAnsi="BRH Malayalam Extra" w:cs="BRH Malayalam Extra"/>
+                <w:color w:val="000000"/>
+                <w:sz w:val="28"/>
+                <w:szCs w:val="40"/>
+              </w:rPr>
+              <w:t>–</w:t>
+            </w:r>
+            <w:r>
+              <w:rPr>
+                <w:rFonts w:ascii="BRH Malayalam Extra" w:hAnsi="BRH Malayalam Extra" w:cs="BRH Malayalam Extra"/>
+                <w:color w:val="000000"/>
+                <w:sz w:val="32"/>
+                <w:szCs w:val="40"/>
+              </w:rPr>
+              <w:t xml:space="preserve"> | | (</w:t>
+            </w:r>
+            <w:r>
+              <w:rPr>
+                <w:rFonts w:cs="BRH Malayalam Extra"/>
+                <w:color w:val="000000"/>
+                <w:szCs w:val="40"/>
+              </w:rPr>
+              <w:t>JD</w:t>
+            </w:r>
+            <w:r>
+              <w:rPr>
+                <w:rFonts w:ascii="BRH Malayalam Extra" w:hAnsi="BRH Malayalam Extra" w:cs="BRH Malayalam Extra"/>
+                <w:color w:val="000000"/>
+                <w:sz w:val="32"/>
+                <w:szCs w:val="40"/>
+              </w:rPr>
+              <w:t>-</w:t>
+            </w:r>
+            <w:r>
+              <w:rPr>
+                <w:rFonts w:cs="BRH Malayalam Extra"/>
+                <w:color w:val="000000"/>
+                <w:szCs w:val="40"/>
+              </w:rPr>
+              <w:t>55</w:t>
+            </w:r>
+            <w:r>
+              <w:rPr>
+                <w:rFonts w:ascii="BRH Malayalam Extra" w:hAnsi="BRH Malayalam Extra" w:cs="BRH Malayalam Extra"/>
+                <w:color w:val="000000"/>
+                <w:sz w:val="32"/>
+                <w:szCs w:val="40"/>
+              </w:rPr>
+              <w:t>)</w:t>
+            </w:r>
+          </w:p>
+          <w:p>
+            <w:pPr>
+              <w:widowControl w:val="0"/>
+              <w:autoSpaceDE w:val="0"/>
+              <w:autoSpaceDN w:val="0"/>
+              <w:adjustRightInd w:val="0"/>
+              <w:spacing w:line="240" w:lineRule="auto"/>
+              <w:rPr>
+                <w:rFonts w:ascii="BRH Malayalam Extra" w:hAnsi="BRH Malayalam Extra" w:cs="BRH Malayalam Extra"/>
+                <w:color w:val="000000"/>
+                <w:sz w:val="32"/>
+                <w:szCs w:val="40"/>
+              </w:rPr>
+            </w:pPr>
+            <w:r>
+              <w:rPr>
+                <w:rFonts w:ascii="BRH Malayalam Extra" w:hAnsi="BRH Malayalam Extra" w:cs="BRH Malayalam Extra"/>
+                <w:color w:val="000000"/>
+                <w:sz w:val="32"/>
+                <w:szCs w:val="40"/>
+              </w:rPr>
+              <w:t>D</w:t>
+            </w:r>
+            <w:r>
+              <w:rPr>
+                <w:rFonts w:ascii="BRH Malayalam Extra" w:hAnsi="BRH Malayalam Extra" w:cs="BRH Malayalam Extra"/>
+                <w:color w:val="000000"/>
+                <w:sz w:val="28"/>
+                <w:szCs w:val="40"/>
+              </w:rPr>
+              <w:t>–</w:t>
+            </w:r>
+            <w:r>
+              <w:rPr>
+                <w:rFonts w:ascii="BRH Malayalam Extra" w:hAnsi="BRH Malayalam Extra" w:cs="BRH Malayalam Extra"/>
+                <w:color w:val="000000"/>
+                <w:sz w:val="32"/>
+                <w:szCs w:val="40"/>
+              </w:rPr>
+              <w:t>ªpz P— ¥Px</w:t>
+            </w:r>
+            <w:r>
+              <w:rPr>
+                <w:rFonts w:ascii="BRH Malayalam Extra" w:hAnsi="BRH Malayalam Extra" w:cs="BRH Malayalam Extra"/>
+                <w:color w:val="000000"/>
+                <w:sz w:val="28"/>
+                <w:szCs w:val="40"/>
+              </w:rPr>
+              <w:t>–</w:t>
+            </w:r>
+            <w:r>
+              <w:rPr>
+                <w:rFonts w:ascii="BRH Malayalam Extra" w:hAnsi="BRH Malayalam Extra" w:cs="BRH Malayalam Extra"/>
+                <w:color w:val="000000"/>
+                <w:sz w:val="32"/>
+                <w:szCs w:val="40"/>
+              </w:rPr>
+              <w:t xml:space="preserve">ªpõ¡—ªpz </w:t>
+            </w:r>
+            <w:r>
+              <w:rPr>
+                <w:rFonts w:ascii="BRH Malayalam Extra" w:hAnsi="BRH Malayalam Extra" w:cs="BRH Malayalam Extra"/>
+                <w:color w:val="000000"/>
+                <w:sz w:val="32"/>
+                <w:szCs w:val="40"/>
+                <w:highlight w:val="green"/>
+              </w:rPr>
+              <w:t>Px</w:t>
+            </w:r>
+            <w:r>
+              <w:rPr>
+                <w:rFonts w:ascii="BRH Malayalam Extra" w:hAnsi="BRH Malayalam Extra" w:cs="BRH Malayalam Extra"/>
+                <w:color w:val="000000"/>
+                <w:sz w:val="32"/>
+                <w:szCs w:val="40"/>
+              </w:rPr>
+              <w:t>sõ</w:t>
+            </w:r>
+            <w:r>
+              <w:rPr>
+                <w:rFonts w:ascii="BRH Malayalam Extra" w:hAnsi="BRH Malayalam Extra" w:cs="BRH Malayalam Extra"/>
+                <w:color w:val="000000"/>
+                <w:sz w:val="32"/>
+                <w:szCs w:val="40"/>
+                <w:highlight w:val="green"/>
+              </w:rPr>
+              <w:t>sy</w:t>
+            </w:r>
+            <w:r>
+              <w:rPr>
+                <w:rFonts w:ascii="BRH Malayalam Extra" w:hAnsi="BRH Malayalam Extra" w:cs="BRH Malayalam Extra"/>
+                <w:color w:val="000000"/>
+                <w:sz w:val="32"/>
+                <w:szCs w:val="40"/>
+              </w:rPr>
+              <w:t xml:space="preserve">— </w:t>
+            </w:r>
+          </w:p>
+          <w:p>
+            <w:pPr>
+              <w:widowControl w:val="0"/>
+              <w:autoSpaceDE w:val="0"/>
+              <w:autoSpaceDN w:val="0"/>
+              <w:adjustRightInd w:val="0"/>
+              <w:spacing w:line="240" w:lineRule="auto"/>
+              <w:rPr>
+                <w:rFonts w:ascii="BRH Malayalam Extra" w:hAnsi="BRH Malayalam Extra" w:cs="BRH Malayalam Extra"/>
+                <w:color w:val="000000"/>
+                <w:sz w:val="32"/>
+                <w:szCs w:val="40"/>
+              </w:rPr>
+            </w:pPr>
+            <w:r>
+              <w:rPr>
+                <w:rFonts w:ascii="BRH Malayalam Extra" w:hAnsi="BRH Malayalam Extra" w:cs="BRH Malayalam Extra"/>
+                <w:color w:val="000000"/>
+                <w:sz w:val="32"/>
+                <w:szCs w:val="40"/>
+              </w:rPr>
+              <w:t>¥Px</w:t>
+            </w:r>
+            <w:r>
+              <w:rPr>
+                <w:rFonts w:ascii="BRH Malayalam Extra" w:hAnsi="BRH Malayalam Extra" w:cs="BRH Malayalam Extra"/>
+                <w:color w:val="000000"/>
+                <w:sz w:val="28"/>
+                <w:szCs w:val="40"/>
+              </w:rPr>
+              <w:t>–</w:t>
+            </w:r>
+            <w:r>
+              <w:rPr>
+                <w:rFonts w:ascii="BRH Malayalam Extra" w:hAnsi="BRH Malayalam Extra" w:cs="BRH Malayalam Extra"/>
+                <w:color w:val="000000"/>
+                <w:sz w:val="32"/>
+                <w:szCs w:val="40"/>
+              </w:rPr>
+              <w:t xml:space="preserve">ªpõ¡—ªpz </w:t>
+            </w:r>
+            <w:r>
+              <w:rPr>
+                <w:rFonts w:ascii="BRH Malayalam Extra" w:hAnsi="BRH Malayalam Extra" w:cs="BRH Malayalam Extra"/>
+                <w:color w:val="000000"/>
+                <w:sz w:val="32"/>
+                <w:szCs w:val="40"/>
+                <w:highlight w:val="green"/>
+              </w:rPr>
+              <w:t>Pxsy—</w:t>
+            </w:r>
+            <w:r>
+              <w:rPr>
+                <w:rFonts w:ascii="BRH Malayalam Extra" w:hAnsi="BRH Malayalam Extra" w:cs="BRH Malayalam Extra"/>
+                <w:color w:val="000000"/>
+                <w:sz w:val="32"/>
+                <w:szCs w:val="40"/>
+              </w:rPr>
+              <w:t xml:space="preserve"> | </w:t>
+            </w:r>
+          </w:p>
+          <w:p>
+            <w:pPr>
+              <w:widowControl w:val="0"/>
+              <w:autoSpaceDE w:val="0"/>
+              <w:autoSpaceDN w:val="0"/>
+              <w:adjustRightInd w:val="0"/>
+              <w:spacing w:line="240" w:lineRule="auto"/>
+              <w:rPr>
+                <w:rFonts w:ascii="BRH Malayalam Extra" w:hAnsi="BRH Malayalam Extra" w:cs="BRH Malayalam Extra"/>
+                <w:color w:val="000000"/>
+                <w:sz w:val="32"/>
+                <w:szCs w:val="40"/>
+              </w:rPr>
+            </w:pPr>
+            <w:r>
+              <w:rPr>
+                <w:rFonts w:cs="BRH Malayalam Extra"/>
+                <w:color w:val="000000"/>
+                <w:szCs w:val="40"/>
+              </w:rPr>
+              <w:t>45</w:t>
+            </w:r>
+            <w:r>
+              <w:rPr>
+                <w:rFonts w:ascii="BRH Malayalam Extra" w:hAnsi="BRH Malayalam Extra" w:cs="BRH Malayalam Extra"/>
+                <w:color w:val="000000"/>
+                <w:sz w:val="32"/>
+                <w:szCs w:val="40"/>
+              </w:rPr>
+              <w:t>)</w:t>
+            </w:r>
+            <w:r>
+              <w:rPr>
+                <w:rFonts w:ascii="BRH Malayalam Extra" w:hAnsi="BRH Malayalam Extra" w:cs="BRH Malayalam Extra"/>
+                <w:color w:val="000000"/>
+                <w:sz w:val="32"/>
+                <w:szCs w:val="40"/>
+              </w:rPr>
+              <w:tab/>
+            </w:r>
+            <w:r>
+              <w:rPr>
+                <w:rFonts w:cs="BRH Malayalam Extra"/>
+                <w:color w:val="000000"/>
+                <w:szCs w:val="40"/>
+              </w:rPr>
+              <w:t>1</w:t>
+            </w:r>
+            <w:r>
+              <w:rPr>
+                <w:rFonts w:ascii="BRH Malayalam Extra" w:hAnsi="BRH Malayalam Extra" w:cs="BRH Malayalam Extra"/>
+                <w:color w:val="000000"/>
+                <w:sz w:val="32"/>
+                <w:szCs w:val="40"/>
+              </w:rPr>
+              <w:t>.</w:t>
+            </w:r>
+            <w:r>
+              <w:rPr>
+                <w:rFonts w:cs="BRH Malayalam Extra"/>
+                <w:color w:val="000000"/>
+                <w:szCs w:val="40"/>
+              </w:rPr>
+              <w:t>1</w:t>
+            </w:r>
+            <w:r>
+              <w:rPr>
+                <w:rFonts w:ascii="BRH Malayalam Extra" w:hAnsi="BRH Malayalam Extra" w:cs="BRH Malayalam Extra"/>
+                <w:color w:val="000000"/>
+                <w:sz w:val="32"/>
+                <w:szCs w:val="40"/>
+              </w:rPr>
+              <w:t>.</w:t>
+            </w:r>
+            <w:r>
+              <w:rPr>
+                <w:rFonts w:cs="BRH Malayalam Extra"/>
+                <w:color w:val="000000"/>
+                <w:szCs w:val="40"/>
+              </w:rPr>
+              <w:t>9</w:t>
+            </w:r>
+            <w:r>
+              <w:rPr>
+                <w:rFonts w:ascii="BRH Malayalam Extra" w:hAnsi="BRH Malayalam Extra" w:cs="BRH Malayalam Extra"/>
+                <w:color w:val="000000"/>
+                <w:sz w:val="32"/>
+                <w:szCs w:val="40"/>
+              </w:rPr>
+              <w:t>.</w:t>
+            </w:r>
+            <w:r>
+              <w:rPr>
+                <w:rFonts w:cs="BRH Malayalam Extra"/>
+                <w:color w:val="000000"/>
+                <w:szCs w:val="40"/>
+              </w:rPr>
+              <w:t>3</w:t>
+            </w:r>
+            <w:r>
+              <w:rPr>
+                <w:rFonts w:ascii="BRH Malayalam Extra" w:hAnsi="BRH Malayalam Extra" w:cs="BRH Malayalam Extra"/>
+                <w:color w:val="000000"/>
+                <w:sz w:val="32"/>
+                <w:szCs w:val="40"/>
+              </w:rPr>
+              <w:t>(</w:t>
+            </w:r>
+            <w:r>
+              <w:rPr>
+                <w:rFonts w:cs="BRH Malayalam Extra"/>
+                <w:color w:val="000000"/>
+                <w:szCs w:val="40"/>
+              </w:rPr>
+              <w:t>42</w:t>
+            </w:r>
+            <w:r>
+              <w:rPr>
+                <w:rFonts w:ascii="BRH Malayalam Extra" w:hAnsi="BRH Malayalam Extra" w:cs="BRH Malayalam Extra"/>
+                <w:color w:val="000000"/>
+                <w:sz w:val="32"/>
+                <w:szCs w:val="40"/>
+              </w:rPr>
+              <w:t>)- P</w:t>
+            </w:r>
+            <w:r>
+              <w:rPr>
+                <w:rFonts w:ascii="BRH Malayalam Extra" w:hAnsi="BRH Malayalam Extra" w:cs="BRH Malayalam Extra"/>
+                <w:color w:val="000000"/>
+                <w:sz w:val="28"/>
+                <w:szCs w:val="40"/>
+              </w:rPr>
+              <w:t>–</w:t>
+            </w:r>
+            <w:r>
+              <w:rPr>
+                <w:rFonts w:ascii="BRH Malayalam Extra" w:hAnsi="BRH Malayalam Extra" w:cs="BRH Malayalam Extra"/>
+                <w:color w:val="000000"/>
+                <w:sz w:val="32"/>
+                <w:szCs w:val="40"/>
+              </w:rPr>
+              <w:t xml:space="preserve"> | </w:t>
+            </w:r>
+            <w:r>
+              <w:rPr>
+                <w:rFonts w:ascii="BRH Malayalam Extra" w:hAnsi="BRH Malayalam Extra" w:cs="BRH Malayalam Extra"/>
+                <w:color w:val="000000"/>
+                <w:sz w:val="32"/>
+                <w:szCs w:val="40"/>
+                <w:highlight w:val="green"/>
+              </w:rPr>
+              <w:t>Asy</w:t>
+            </w:r>
+            <w:r>
+              <w:rPr>
+                <w:rFonts w:ascii="BRH Malayalam Extra" w:hAnsi="BRH Malayalam Extra" w:cs="BRH Malayalam Extra"/>
+                <w:color w:val="000000"/>
+                <w:sz w:val="32"/>
+                <w:szCs w:val="40"/>
+              </w:rPr>
+              <w:t>— | psûz˜ |</w:t>
+            </w:r>
+          </w:p>
+          <w:p>
+            <w:pPr>
+              <w:widowControl w:val="0"/>
+              <w:autoSpaceDE w:val="0"/>
+              <w:autoSpaceDN w:val="0"/>
+              <w:adjustRightInd w:val="0"/>
+              <w:spacing w:line="240" w:lineRule="auto"/>
+              <w:rPr>
+                <w:rFonts w:ascii="BRH Malayalam Extra" w:hAnsi="BRH Malayalam Extra" w:cs="BRH Malayalam Extra"/>
+                <w:color w:val="000000"/>
+                <w:sz w:val="32"/>
+                <w:szCs w:val="40"/>
+              </w:rPr>
+            </w:pPr>
+            <w:r>
+              <w:rPr>
+                <w:rFonts w:ascii="BRH Malayalam Extra" w:hAnsi="BRH Malayalam Extra" w:cs="BRH Malayalam Extra"/>
+                <w:color w:val="000000"/>
+                <w:sz w:val="32"/>
+                <w:szCs w:val="40"/>
+                <w:highlight w:val="green"/>
+              </w:rPr>
+              <w:t>Pxsõsy—</w:t>
+            </w:r>
+            <w:r>
+              <w:rPr>
+                <w:rFonts w:ascii="BRH Malayalam Extra" w:hAnsi="BRH Malayalam Extra" w:cs="BRH Malayalam Extra"/>
+                <w:color w:val="000000"/>
+                <w:sz w:val="32"/>
+                <w:szCs w:val="40"/>
+              </w:rPr>
+              <w:t xml:space="preserve"> P</w:t>
+            </w:r>
+            <w:r>
+              <w:rPr>
+                <w:rFonts w:ascii="BRH Malayalam Extra" w:hAnsi="BRH Malayalam Extra" w:cs="BRH Malayalam Extra"/>
+                <w:color w:val="000000"/>
+                <w:sz w:val="28"/>
+                <w:szCs w:val="40"/>
+              </w:rPr>
+              <w:t>–</w:t>
+            </w:r>
+            <w:r>
+              <w:rPr>
+                <w:rFonts w:ascii="BRH Malayalam Extra" w:hAnsi="BRH Malayalam Extra" w:cs="BRH Malayalam Extra"/>
+                <w:color w:val="000000"/>
+                <w:sz w:val="32"/>
+                <w:szCs w:val="40"/>
+              </w:rPr>
+              <w:t xml:space="preserve"> </w:t>
+            </w:r>
+            <w:r>
+              <w:rPr>
+                <w:rFonts w:ascii="BRH Malayalam Extra" w:hAnsi="BRH Malayalam Extra" w:cs="BRH Malayalam Extra"/>
+                <w:color w:val="000000"/>
+                <w:sz w:val="32"/>
+                <w:szCs w:val="40"/>
+                <w:highlight w:val="green"/>
+              </w:rPr>
+              <w:t>Px</w:t>
+            </w:r>
+            <w:r>
+              <w:rPr>
+                <w:rFonts w:ascii="BRH Malayalam Extra" w:hAnsi="BRH Malayalam Extra" w:cs="BRH Malayalam Extra"/>
+                <w:color w:val="000000"/>
+                <w:sz w:val="32"/>
+                <w:szCs w:val="40"/>
+              </w:rPr>
+              <w:t>sy</w:t>
+            </w:r>
+            <w:r>
+              <w:rPr>
+                <w:rFonts w:ascii="BRH Malayalam Extra" w:hAnsi="BRH Malayalam Extra" w:cs="BRH Malayalam Extra"/>
+                <w:color w:val="000000"/>
+                <w:sz w:val="28"/>
+                <w:szCs w:val="40"/>
+              </w:rPr>
+              <w:t>–</w:t>
+            </w:r>
+            <w:r>
+              <w:rPr>
+                <w:rFonts w:ascii="BRH Malayalam Extra" w:hAnsi="BRH Malayalam Extra" w:cs="BRH Malayalam Extra"/>
+                <w:color w:val="000000"/>
+                <w:sz w:val="32"/>
+                <w:szCs w:val="40"/>
+              </w:rPr>
+              <w:t xml:space="preserve"> psûz</w:t>
+            </w:r>
+            <w:r>
+              <w:rPr>
+                <w:rFonts w:ascii="BRH Malayalam Extra" w:hAnsi="BRH Malayalam Extra" w:cs="BRH Malayalam Extra"/>
+                <w:color w:val="000000"/>
+                <w:sz w:val="28"/>
+                <w:szCs w:val="40"/>
+              </w:rPr>
+              <w:t>–</w:t>
+            </w:r>
+            <w:r>
+              <w:rPr>
+                <w:rFonts w:ascii="BRH Malayalam Extra" w:hAnsi="BRH Malayalam Extra" w:cs="BRH Malayalam Extra"/>
+                <w:color w:val="000000"/>
+                <w:sz w:val="32"/>
+                <w:szCs w:val="40"/>
+              </w:rPr>
+              <w:t xml:space="preserve"> p</w:t>
+            </w:r>
+            <w:r>
+              <w:rPr>
+                <w:rFonts w:ascii="BRH Malayalam Extra" w:hAnsi="BRH Malayalam Extra" w:cs="BRH Malayalam Extra"/>
+                <w:color w:val="000000"/>
+                <w:sz w:val="32"/>
+                <w:szCs w:val="40"/>
+                <w:highlight w:val="green"/>
+              </w:rPr>
+              <w:t>sûõsy</w:t>
+            </w:r>
+            <w:r>
+              <w:rPr>
+                <w:rFonts w:ascii="BRH Malayalam Extra" w:hAnsi="BRH Malayalam Extra" w:cs="BRH Malayalam Extra"/>
+                <w:color w:val="000000"/>
+                <w:sz w:val="32"/>
+                <w:szCs w:val="40"/>
+              </w:rPr>
+              <w:t xml:space="preserve">— </w:t>
+            </w:r>
+            <w:r>
+              <w:rPr>
+                <w:rFonts w:ascii="BRH Malayalam Extra" w:hAnsi="BRH Malayalam Extra" w:cs="BRH Malayalam Extra"/>
+                <w:color w:val="000000"/>
+                <w:sz w:val="32"/>
+                <w:szCs w:val="40"/>
+                <w:highlight w:val="green"/>
+              </w:rPr>
+              <w:t>P</w:t>
+            </w:r>
+            <w:r>
+              <w:rPr>
+                <w:rFonts w:ascii="BRH Malayalam Extra" w:hAnsi="BRH Malayalam Extra" w:cs="BRH Malayalam Extra"/>
+                <w:color w:val="000000"/>
+                <w:sz w:val="28"/>
+                <w:szCs w:val="40"/>
+              </w:rPr>
+              <w:t>–</w:t>
+            </w:r>
+            <w:r>
+              <w:rPr>
+                <w:rFonts w:ascii="BRH Malayalam Extra" w:hAnsi="BRH Malayalam Extra" w:cs="BRH Malayalam Extra"/>
+                <w:color w:val="000000"/>
+                <w:sz w:val="32"/>
+                <w:szCs w:val="40"/>
+              </w:rPr>
+              <w:t xml:space="preserve"> </w:t>
+            </w:r>
+          </w:p>
+          <w:p>
+            <w:pPr>
+              <w:widowControl w:val="0"/>
+              <w:autoSpaceDE w:val="0"/>
+              <w:autoSpaceDN w:val="0"/>
+              <w:adjustRightInd w:val="0"/>
+              <w:spacing w:line="240" w:lineRule="auto"/>
+              <w:rPr>
+                <w:rFonts w:ascii="BRH Malayalam Extra" w:hAnsi="BRH Malayalam Extra" w:cs="BRH Malayalam Extra"/>
+                <w:color w:val="000000"/>
+                <w:sz w:val="32"/>
+                <w:szCs w:val="40"/>
+              </w:rPr>
+            </w:pPr>
+            <w:r>
+              <w:rPr>
+                <w:rFonts w:ascii="BRH Malayalam Extra" w:hAnsi="BRH Malayalam Extra" w:cs="BRH Malayalam Extra"/>
+                <w:color w:val="000000"/>
+                <w:sz w:val="32"/>
+                <w:szCs w:val="40"/>
+              </w:rPr>
+              <w:t>Pxsy</w:t>
+            </w:r>
+            <w:r>
+              <w:rPr>
+                <w:rFonts w:ascii="BRH Malayalam Extra" w:hAnsi="BRH Malayalam Extra" w:cs="BRH Malayalam Extra"/>
+                <w:color w:val="000000"/>
+                <w:sz w:val="28"/>
+                <w:szCs w:val="40"/>
+              </w:rPr>
+              <w:t>–</w:t>
+            </w:r>
+            <w:r>
+              <w:rPr>
+                <w:rFonts w:ascii="BRH Malayalam Extra" w:hAnsi="BRH Malayalam Extra" w:cs="BRH Malayalam Extra"/>
+                <w:color w:val="000000"/>
+                <w:sz w:val="32"/>
+                <w:szCs w:val="40"/>
+              </w:rPr>
+              <w:t xml:space="preserve"> psûz˜ | </w:t>
+            </w:r>
+          </w:p>
+          <w:p>
+            <w:pPr>
+              <w:widowControl w:val="0"/>
+              <w:autoSpaceDE w:val="0"/>
+              <w:autoSpaceDN w:val="0"/>
+              <w:adjustRightInd w:val="0"/>
+              <w:spacing w:line="240" w:lineRule="auto"/>
+              <w:rPr>
+                <w:rFonts w:ascii="BRH Malayalam Extra" w:hAnsi="BRH Malayalam Extra" w:cs="BRH Malayalam Extra"/>
+                <w:color w:val="000000"/>
+                <w:sz w:val="32"/>
+                <w:szCs w:val="40"/>
+              </w:rPr>
+            </w:pPr>
+            <w:r>
+              <w:rPr>
+                <w:rFonts w:cs="BRH Malayalam Extra"/>
+                <w:color w:val="000000"/>
+                <w:szCs w:val="40"/>
+              </w:rPr>
+              <w:t>46</w:t>
+            </w:r>
+            <w:r>
+              <w:rPr>
+                <w:rFonts w:ascii="BRH Malayalam Extra" w:hAnsi="BRH Malayalam Extra" w:cs="BRH Malayalam Extra"/>
+                <w:color w:val="000000"/>
+                <w:sz w:val="32"/>
+                <w:szCs w:val="40"/>
+              </w:rPr>
+              <w:t>)</w:t>
+            </w:r>
+            <w:r>
+              <w:rPr>
+                <w:rFonts w:ascii="BRH Malayalam Extra" w:hAnsi="BRH Malayalam Extra" w:cs="BRH Malayalam Extra"/>
+                <w:color w:val="000000"/>
+                <w:sz w:val="32"/>
+                <w:szCs w:val="40"/>
+              </w:rPr>
+              <w:tab/>
+            </w:r>
+            <w:r>
+              <w:rPr>
+                <w:rFonts w:cs="BRH Malayalam Extra"/>
+                <w:color w:val="000000"/>
+                <w:szCs w:val="40"/>
+              </w:rPr>
+              <w:t>1</w:t>
+            </w:r>
+            <w:r>
+              <w:rPr>
+                <w:rFonts w:ascii="BRH Malayalam Extra" w:hAnsi="BRH Malayalam Extra" w:cs="BRH Malayalam Extra"/>
+                <w:color w:val="000000"/>
+                <w:sz w:val="32"/>
+                <w:szCs w:val="40"/>
+              </w:rPr>
+              <w:t>.</w:t>
+            </w:r>
+            <w:r>
+              <w:rPr>
+                <w:rFonts w:cs="BRH Malayalam Extra"/>
+                <w:color w:val="000000"/>
+                <w:szCs w:val="40"/>
+              </w:rPr>
+              <w:t>1</w:t>
+            </w:r>
+            <w:r>
+              <w:rPr>
+                <w:rFonts w:ascii="BRH Malayalam Extra" w:hAnsi="BRH Malayalam Extra" w:cs="BRH Malayalam Extra"/>
+                <w:color w:val="000000"/>
+                <w:sz w:val="32"/>
+                <w:szCs w:val="40"/>
+              </w:rPr>
+              <w:t>.</w:t>
+            </w:r>
+            <w:r>
+              <w:rPr>
+                <w:rFonts w:cs="BRH Malayalam Extra"/>
+                <w:color w:val="000000"/>
+                <w:szCs w:val="40"/>
+              </w:rPr>
+              <w:t>9</w:t>
+            </w:r>
+            <w:r>
+              <w:rPr>
+                <w:rFonts w:ascii="BRH Malayalam Extra" w:hAnsi="BRH Malayalam Extra" w:cs="BRH Malayalam Extra"/>
+                <w:color w:val="000000"/>
+                <w:sz w:val="32"/>
+                <w:szCs w:val="40"/>
+              </w:rPr>
+              <w:t>.</w:t>
+            </w:r>
+            <w:r>
+              <w:rPr>
+                <w:rFonts w:cs="BRH Malayalam Extra"/>
+                <w:color w:val="000000"/>
+                <w:szCs w:val="40"/>
+              </w:rPr>
+              <w:t>3</w:t>
+            </w:r>
+            <w:r>
+              <w:rPr>
+                <w:rFonts w:ascii="BRH Malayalam Extra" w:hAnsi="BRH Malayalam Extra" w:cs="BRH Malayalam Extra"/>
+                <w:color w:val="000000"/>
+                <w:sz w:val="32"/>
+                <w:szCs w:val="40"/>
+              </w:rPr>
+              <w:t>(</w:t>
+            </w:r>
+            <w:r>
+              <w:rPr>
+                <w:rFonts w:cs="BRH Malayalam Extra"/>
+                <w:color w:val="000000"/>
+                <w:szCs w:val="40"/>
+              </w:rPr>
+              <w:t>43</w:t>
+            </w:r>
+            <w:r>
+              <w:rPr>
+                <w:rFonts w:ascii="BRH Malayalam Extra" w:hAnsi="BRH Malayalam Extra" w:cs="BRH Malayalam Extra"/>
+                <w:color w:val="000000"/>
+                <w:sz w:val="32"/>
+                <w:szCs w:val="40"/>
+              </w:rPr>
+              <w:t xml:space="preserve">)- </w:t>
+            </w:r>
+            <w:r>
+              <w:rPr>
+                <w:rFonts w:ascii="BRH Malayalam Extra" w:hAnsi="BRH Malayalam Extra" w:cs="BRH Malayalam Extra"/>
+                <w:color w:val="000000"/>
+                <w:sz w:val="32"/>
+                <w:szCs w:val="40"/>
+                <w:highlight w:val="green"/>
+              </w:rPr>
+              <w:t>Asy</w:t>
+            </w:r>
+            <w:r>
+              <w:rPr>
+                <w:rFonts w:ascii="BRH Malayalam Extra" w:hAnsi="BRH Malayalam Extra" w:cs="BRH Malayalam Extra"/>
+                <w:color w:val="000000"/>
+                <w:sz w:val="32"/>
+                <w:szCs w:val="40"/>
+              </w:rPr>
+              <w:t>— | psûz˜ | P</w:t>
+            </w:r>
+            <w:r>
+              <w:rPr>
+                <w:rFonts w:ascii="BRH Malayalam Extra" w:hAnsi="BRH Malayalam Extra" w:cs="BRH Malayalam Extra"/>
+                <w:color w:val="000000"/>
+                <w:sz w:val="28"/>
+                <w:szCs w:val="40"/>
+              </w:rPr>
+              <w:t>–</w:t>
+            </w:r>
+            <w:r>
+              <w:rPr>
+                <w:rFonts w:ascii="BRH Malayalam Extra" w:hAnsi="BRH Malayalam Extra" w:cs="BRH Malayalam Extra"/>
+                <w:color w:val="000000"/>
+                <w:sz w:val="32"/>
+                <w:szCs w:val="40"/>
+              </w:rPr>
+              <w:t xml:space="preserve"> |</w:t>
+            </w:r>
+          </w:p>
+          <w:p>
+            <w:pPr>
+              <w:widowControl w:val="0"/>
+              <w:autoSpaceDE w:val="0"/>
+              <w:autoSpaceDN w:val="0"/>
+              <w:adjustRightInd w:val="0"/>
+              <w:spacing w:line="240" w:lineRule="auto"/>
+              <w:rPr>
+                <w:rFonts w:ascii="BRH Malayalam Extra" w:hAnsi="BRH Malayalam Extra" w:cs="BRH Malayalam Extra"/>
+                <w:sz w:val="28"/>
+                <w:szCs w:val="36"/>
+              </w:rPr>
+            </w:pPr>
+            <w:r>
+              <w:rPr>
+                <w:rFonts w:ascii="BRH Malayalam Extra" w:hAnsi="BRH Malayalam Extra" w:cs="BRH Malayalam Extra"/>
+                <w:color w:val="000000"/>
+                <w:sz w:val="32"/>
+                <w:szCs w:val="40"/>
+                <w:highlight w:val="green"/>
+              </w:rPr>
+              <w:t>A</w:t>
+            </w:r>
+            <w:r>
+              <w:rPr>
+                <w:rFonts w:ascii="BRH Malayalam Extra" w:hAnsi="BRH Malayalam Extra" w:cs="BRH Malayalam Extra"/>
+                <w:color w:val="000000"/>
+                <w:sz w:val="32"/>
+                <w:szCs w:val="40"/>
+              </w:rPr>
+              <w:t>sy</w:t>
+            </w:r>
+            <w:r>
+              <w:rPr>
+                <w:rFonts w:ascii="BRH Malayalam Extra" w:hAnsi="BRH Malayalam Extra" w:cs="BRH Malayalam Extra"/>
+                <w:color w:val="000000"/>
+                <w:sz w:val="28"/>
+                <w:szCs w:val="40"/>
+              </w:rPr>
+              <w:t>–</w:t>
+            </w:r>
+            <w:r>
+              <w:rPr>
+                <w:rFonts w:ascii="BRH Malayalam Extra" w:hAnsi="BRH Malayalam Extra" w:cs="BRH Malayalam Extra"/>
+                <w:color w:val="000000"/>
+                <w:sz w:val="32"/>
+                <w:szCs w:val="40"/>
+              </w:rPr>
+              <w:t xml:space="preserve"> psûz</w:t>
+            </w:r>
+            <w:r>
+              <w:rPr>
+                <w:rFonts w:ascii="BRH Malayalam Extra" w:hAnsi="BRH Malayalam Extra" w:cs="BRH Malayalam Extra"/>
+                <w:color w:val="000000"/>
+                <w:sz w:val="28"/>
+                <w:szCs w:val="40"/>
+              </w:rPr>
+              <w:t>–</w:t>
+            </w:r>
+            <w:r>
+              <w:rPr>
+                <w:rFonts w:ascii="BRH Malayalam Extra" w:hAnsi="BRH Malayalam Extra" w:cs="BRH Malayalam Extra"/>
+                <w:color w:val="000000"/>
+                <w:sz w:val="32"/>
+                <w:szCs w:val="40"/>
+              </w:rPr>
+              <w:t xml:space="preserve"> p</w:t>
+            </w:r>
+            <w:r>
+              <w:rPr>
+                <w:rFonts w:ascii="BRH Malayalam Extra" w:hAnsi="BRH Malayalam Extra" w:cs="BRH Malayalam Extra"/>
+                <w:color w:val="000000"/>
+                <w:sz w:val="32"/>
+                <w:szCs w:val="40"/>
+                <w:highlight w:val="green"/>
+              </w:rPr>
+              <w:t>sûõ</w:t>
+            </w:r>
+            <w:r>
+              <w:rPr>
+                <w:rFonts w:ascii="BRH Malayalam Extra" w:hAnsi="BRH Malayalam Extra" w:cs="BRH Malayalam Extra"/>
+                <w:color w:val="000000"/>
+                <w:sz w:val="32"/>
+                <w:szCs w:val="40"/>
+              </w:rPr>
+              <w:t>sõsy</w:t>
+            </w:r>
+            <w:r>
+              <w:rPr>
+                <w:rFonts w:ascii="BRH Malayalam Extra" w:hAnsi="BRH Malayalam Extra" w:cs="BRH Malayalam Extra"/>
+                <w:color w:val="000000"/>
+                <w:sz w:val="28"/>
+                <w:szCs w:val="40"/>
+              </w:rPr>
+              <w:t>–</w:t>
+            </w:r>
+            <w:r>
+              <w:rPr>
+                <w:rFonts w:ascii="BRH Malayalam Extra" w:hAnsi="BRH Malayalam Extra" w:cs="BRH Malayalam Extra"/>
+                <w:color w:val="000000"/>
+                <w:sz w:val="32"/>
+                <w:szCs w:val="40"/>
+              </w:rPr>
+              <w:t xml:space="preserve"> psûz— P P</w:t>
+            </w:r>
+            <w:r>
+              <w:rPr>
+                <w:rFonts w:ascii="BRH Malayalam Extra" w:hAnsi="BRH Malayalam Extra" w:cs="BRH Malayalam Extra"/>
+                <w:color w:val="000000"/>
+                <w:sz w:val="28"/>
+                <w:szCs w:val="40"/>
+              </w:rPr>
+              <w:t>–</w:t>
+            </w:r>
+            <w:r>
+              <w:rPr>
+                <w:rFonts w:ascii="BRH Malayalam Extra" w:hAnsi="BRH Malayalam Extra" w:cs="BRH Malayalam Extra"/>
+                <w:color w:val="000000"/>
+                <w:sz w:val="32"/>
+                <w:szCs w:val="40"/>
+              </w:rPr>
+              <w:t xml:space="preserve"> p</w:t>
+            </w:r>
+            <w:r>
+              <w:rPr>
+                <w:rFonts w:ascii="BRH Malayalam Extra" w:hAnsi="BRH Malayalam Extra" w:cs="BRH Malayalam Extra"/>
+                <w:color w:val="000000"/>
+                <w:sz w:val="32"/>
+                <w:szCs w:val="40"/>
+                <w:highlight w:val="green"/>
+              </w:rPr>
+              <w:t>sûõ</w:t>
+            </w:r>
+            <w:r>
+              <w:rPr>
+                <w:rFonts w:ascii="BRH Malayalam Extra" w:hAnsi="BRH Malayalam Extra" w:cs="BRH Malayalam Extra"/>
+                <w:color w:val="000000"/>
+                <w:sz w:val="32"/>
+                <w:szCs w:val="40"/>
+              </w:rPr>
+              <w:t>sõsy</w:t>
+            </w:r>
+            <w:r>
+              <w:rPr>
+                <w:rFonts w:ascii="BRH Malayalam Extra" w:hAnsi="BRH Malayalam Extra" w:cs="BRH Malayalam Extra"/>
+                <w:color w:val="000000"/>
+                <w:sz w:val="28"/>
+                <w:szCs w:val="40"/>
+              </w:rPr>
+              <w:t>–</w:t>
+            </w:r>
+            <w:r>
+              <w:rPr>
+                <w:rFonts w:ascii="BRH Malayalam Extra" w:hAnsi="BRH Malayalam Extra" w:cs="BRH Malayalam Extra"/>
+                <w:color w:val="000000"/>
+                <w:sz w:val="32"/>
+                <w:szCs w:val="40"/>
+              </w:rPr>
+              <w:t xml:space="preserve"> psûz— P | </w:t>
+            </w:r>
+          </w:p>
+        </w:tc>
+      </w:tr>
+    </w:tbl>
+    <w:p>
+      <w:pPr>
+        <w:spacing w:before="0" w:line="240" w:lineRule="auto"/>
+        <w:jc w:val="center"/>
+        <w:rPr>
+          <w:b/>
+          <w:bCs/>
+          <w:sz w:val="32"/>
+          <w:szCs w:val="32"/>
+          <w:u w:val="single"/>
+        </w:rPr>
+      </w:pPr>
+    </w:p>
+    <w:p>
+      <w:pPr>
+        <w:spacing w:before="0" w:line="240" w:lineRule="auto"/>
+        <w:jc w:val="center"/>
+        <w:rPr>
+          <w:b/>
+          <w:bCs/>
+          <w:sz w:val="32"/>
+          <w:szCs w:val="32"/>
+          <w:u w:val="single"/>
+        </w:rPr>
+      </w:pPr>
+    </w:p>
     <w:p>
       <w:pPr>
         <w:spacing w:before="0" w:line="240" w:lineRule="auto"/>
@@ -32,29 +2474,7 @@
           <w:szCs w:val="32"/>
           <w:u w:val="single"/>
         </w:rPr>
-        <w:t>31</w:t>
-      </w:r>
-      <w:proofErr w:type="gramStart"/>
-      <w:r>
-        <w:rPr>
-          <w:b/>
-          <w:bCs/>
-          <w:sz w:val="32"/>
-          <w:szCs w:val="32"/>
-          <w:u w:val="single"/>
-        </w:rPr>
-        <w:t>st  Jan</w:t>
-      </w:r>
-      <w:proofErr w:type="gramEnd"/>
-      <w:r>
-        <w:rPr>
-          <w:b/>
-          <w:bCs/>
-          <w:sz w:val="32"/>
-          <w:szCs w:val="32"/>
-          <w:u w:val="single"/>
-        </w:rPr>
-        <w:t xml:space="preserve"> 2023</w:t>
+        <w:t>31st  Jan 2023</w:t>
       </w:r>
     </w:p>
     <w:p>
@@ -75,27 +2495,7 @@
           <w:sz w:val="28"/>
           <w:szCs w:val="32"/>
         </w:rPr>
-        <w:t>(</w:t>
-      </w:r>
-      <w:proofErr w:type="gramStart"/>
-      <w:r>
-        <w:rPr>
-          <w:b/>
-          <w:bCs/>
-          <w:sz w:val="28"/>
-          <w:szCs w:val="32"/>
-        </w:rPr>
-        <w:t>ignore</w:t>
-      </w:r>
-      <w:proofErr w:type="gramEnd"/>
-      <w:r>
-        <w:rPr>
-          <w:b/>
-          <w:bCs/>
-          <w:sz w:val="28"/>
-          <w:szCs w:val="32"/>
-        </w:rPr>
-        <w:t xml:space="preserve"> those which are already incorporated in your book’s version and date)</w:t>
+        <w:t>(ignore those which are already incorporated in your book’s version and date)</w:t>
       </w:r>
     </w:p>
     <w:tbl>
@@ -229,6 +2629,7 @@
                 <w:szCs w:val="28"/>
                 <w:u w:val="single"/>
               </w:rPr>
+              <w:lastRenderedPageBreak/>
               <w:t>TS 1.1</w:t>
             </w:r>
             <w:r>
@@ -1840,19 +4241,8 @@
                 <w:sz w:val="28"/>
                 <w:szCs w:val="32"/>
               </w:rPr>
-              <w:t xml:space="preserve">will not be any swaram </w:t>
-            </w:r>
-            <w:proofErr w:type="gramStart"/>
-            <w:r>
-              <w:rPr>
-                <w:b/>
-                <w:bCs/>
-                <w:sz w:val="28"/>
-                <w:szCs w:val="32"/>
-              </w:rPr>
-              <w:t>change .</w:t>
-            </w:r>
-            <w:proofErr w:type="gramEnd"/>
+              <w:t>will not be any swaram change .</w:t>
+            </w:r>
             <w:r>
               <w:rPr>
                 <w:rFonts w:ascii="BRH Malayalam Extra" w:hAnsi="BRH Malayalam Extra" w:cs="BRH Malayalam Extra"/>
@@ -7434,7 +9824,6 @@
                 <w:color w:val="000000"/>
                 <w:szCs w:val="40"/>
               </w:rPr>
-              <w:lastRenderedPageBreak/>
               <w:t>47</w:t>
             </w:r>
             <w:r>
@@ -8223,7 +10612,6 @@
                 <w:color w:val="000000"/>
                 <w:szCs w:val="40"/>
               </w:rPr>
-              <w:lastRenderedPageBreak/>
               <w:t>47</w:t>
             </w:r>
             <w:r>
@@ -10173,6 +12561,7 @@
                 <w:szCs w:val="40"/>
                 <w:highlight w:val="yellow"/>
               </w:rPr>
+              <w:lastRenderedPageBreak/>
               <w:t>M</w:t>
             </w:r>
             <w:r>
@@ -10246,6 +12635,7 @@
                 <w:color w:val="000000"/>
                 <w:szCs w:val="40"/>
               </w:rPr>
+              <w:lastRenderedPageBreak/>
               <w:t>43</w:t>
             </w:r>
             <w:r>
@@ -11824,6 +14214,7 @@
                 <w:szCs w:val="40"/>
                 <w:highlight w:val="green"/>
               </w:rPr>
+              <w:lastRenderedPageBreak/>
               <w:t>M—</w:t>
             </w:r>
             <w:r>
@@ -12501,6 +14892,7 @@
                 <w:szCs w:val="40"/>
                 <w:lang w:val="it-IT"/>
               </w:rPr>
+              <w:lastRenderedPageBreak/>
               <w:t>26</w:t>
             </w:r>
             <w:r>
@@ -17034,7 +19426,6 @@
                 <w:color w:val="000000"/>
                 <w:szCs w:val="40"/>
               </w:rPr>
-              <w:lastRenderedPageBreak/>
               <w:t>31</w:t>
             </w:r>
             <w:r>
@@ -17822,6 +20213,7 @@
                 <w:color w:val="000000"/>
                 <w:szCs w:val="40"/>
               </w:rPr>
+              <w:lastRenderedPageBreak/>
               <w:t>29</w:t>
             </w:r>
             <w:r>
@@ -19714,7 +22106,6 @@
                 <w:szCs w:val="40"/>
                 <w:highlight w:val="yellow"/>
               </w:rPr>
-              <w:lastRenderedPageBreak/>
               <w:t>C—öÉx</w:t>
             </w:r>
             <w:r>
@@ -19964,6 +22355,7 @@
                 <w:color w:val="000000"/>
                 <w:szCs w:val="40"/>
               </w:rPr>
+              <w:lastRenderedPageBreak/>
               <w:t>4</w:t>
             </w:r>
             <w:r>
@@ -21807,7 +24199,6 @@
                 <w:szCs w:val="40"/>
                 <w:highlight w:val="green"/>
               </w:rPr>
-              <w:lastRenderedPageBreak/>
               <w:t>C</w:t>
             </w:r>
             <w:r>
@@ -22049,6 +24440,7 @@
                 <w:color w:val="000000"/>
                 <w:szCs w:val="40"/>
               </w:rPr>
+              <w:lastRenderedPageBreak/>
               <w:t>4</w:t>
             </w:r>
             <w:r>
@@ -22686,27 +25078,7 @@
           <w:sz w:val="28"/>
           <w:szCs w:val="32"/>
         </w:rPr>
-        <w:t>(</w:t>
-      </w:r>
-      <w:proofErr w:type="gramStart"/>
-      <w:r>
-        <w:rPr>
-          <w:b/>
-          <w:bCs/>
-          <w:sz w:val="28"/>
-          <w:szCs w:val="32"/>
-        </w:rPr>
-        <w:t>ignore</w:t>
-      </w:r>
-      <w:proofErr w:type="gramEnd"/>
-      <w:r>
-        <w:rPr>
-          <w:b/>
-          <w:bCs/>
-          <w:sz w:val="28"/>
-          <w:szCs w:val="32"/>
-        </w:rPr>
-        <w:t xml:space="preserve"> those which are already incorporated in your book’s version and date)</w:t>
+        <w:t>(ignore those which are already incorporated in your book’s version and date)</w:t>
       </w:r>
     </w:p>
     <w:tbl>
@@ -22768,6 +25140,7 @@
                 <w:sz w:val="32"/>
                 <w:szCs w:val="32"/>
               </w:rPr>
+              <w:lastRenderedPageBreak/>
               <w:t>Reference</w:t>
             </w:r>
           </w:p>
@@ -22792,6 +25165,7 @@
                 <w:sz w:val="32"/>
                 <w:szCs w:val="32"/>
               </w:rPr>
+              <w:lastRenderedPageBreak/>
               <w:t>As Printed</w:t>
             </w:r>
           </w:p>
@@ -23171,27 +25545,7 @@
                 <w:sz w:val="28"/>
                 <w:szCs w:val="32"/>
               </w:rPr>
-              <w:t>(</w:t>
-            </w:r>
-            <w:proofErr w:type="gramStart"/>
-            <w:r>
-              <w:rPr>
-                <w:b/>
-                <w:bCs/>
-                <w:sz w:val="28"/>
-                <w:szCs w:val="32"/>
-              </w:rPr>
-              <w:t>no</w:t>
-            </w:r>
-            <w:proofErr w:type="gramEnd"/>
-            <w:r>
-              <w:rPr>
-                <w:b/>
-                <w:bCs/>
-                <w:sz w:val="28"/>
-                <w:szCs w:val="32"/>
-              </w:rPr>
-              <w:t xml:space="preserve"> elision for “a”</w:t>
+              <w:t>(no elision for “a”</w:t>
             </w:r>
             <w:r>
               <w:rPr>
@@ -23311,27 +25665,7 @@
           <w:sz w:val="28"/>
           <w:szCs w:val="32"/>
         </w:rPr>
-        <w:t>(</w:t>
-      </w:r>
-      <w:proofErr w:type="gramStart"/>
-      <w:r>
-        <w:rPr>
-          <w:b/>
-          <w:bCs/>
-          <w:sz w:val="28"/>
-          <w:szCs w:val="32"/>
-        </w:rPr>
-        <w:t>ignore</w:t>
-      </w:r>
-      <w:proofErr w:type="gramEnd"/>
-      <w:r>
-        <w:rPr>
-          <w:b/>
-          <w:bCs/>
-          <w:sz w:val="28"/>
-          <w:szCs w:val="32"/>
-        </w:rPr>
-        <w:t xml:space="preserve"> those which are already incorporated in your book’s version and date)</w:t>
+        <w:t>(ignore those which are already incorporated in your book’s version and date)</w:t>
       </w:r>
     </w:p>
     <w:tbl>
@@ -23611,7 +25945,7 @@
 </file>
 
 <file path=word/endnotes.xml><?xml version="1.0" encoding="utf-8"?>
-<w:endnotes xmlns:wpc="http://schemas.microsoft.com/office/word/2010/wordprocessingCanvas" xmlns:cx="http://schemas.microsoft.com/office/drawing/2014/chartex" xmlns:cx1="http://schemas.microsoft.com/office/drawing/2015/9/8/chartex" xmlns:cx2="http://schemas.microsoft.com/office/drawing/2015/10/21/chartex" xmlns:cx3="http://schemas.microsoft.com/office/drawing/2016/5/9/chartex" xmlns:cx4="http://schemas.microsoft.com/office/drawing/2016/5/10/chartex" xmlns:cx5="http://schemas.microsoft.com/office/drawing/2016/5/11/chartex" xmlns:cx6="http://schemas.microsoft.com/office/drawing/2016/5/12/chartex" xmlns:cx7="http://schemas.microsoft.com/office/drawing/2016/5/13/chartex" xmlns:cx8="http://schemas.microsoft.com/office/drawing/2016/5/14/chartex" xmlns:mc="http://schemas.openxmlformats.org/markup-compatibility/2006" xmlns:aink="http://schemas.microsoft.com/office/drawing/2016/ink" xmlns:am3d="http://schemas.microsoft.com/office/drawing/2017/model3d" xmlns:o="urn:schemas-microsoft-com:office:office" xmlns:oel="http://schemas.microsoft.com/office/2019/extlst" xmlns:r="http://schemas.openxmlformats.org/officeDocument/2006/relationships" xmlns:m="http://schemas.openxmlformats.org/officeDocument/2006/math" xmlns:v="urn:schemas-microsoft-com:vml" xmlns:wp14="http://schemas.microsoft.com/office/word/2010/wordprocessingDrawing" xmlns:wp="http://schemas.openxmlformats.org/drawingml/2006/wordprocessingDrawing" xmlns:w10="urn:schemas-microsoft-com:office:word" xmlns:w="http://schemas.openxmlformats.org/wordprocessingml/2006/main" xmlns:w14="http://schemas.microsoft.com/office/word/2010/wordml" xmlns:w15="http://schemas.microsoft.com/office/word/2012/wordml" xmlns:w16cex="http://schemas.microsoft.com/office/word/2018/wordml/cex" xmlns:w16cid="http://schemas.microsoft.com/office/word/2016/wordml/cid" xmlns:w16="http://schemas.microsoft.com/office/word/2018/wordml" xmlns:w16sdtdh="http://schemas.microsoft.com/office/word/2020/wordml/sdtdatahash" xmlns:w16se="http://schemas.microsoft.com/office/word/2015/wordml/symex" xmlns:wpg="http://schemas.microsoft.com/office/word/2010/wordprocessingGroup" xmlns:wpi="http://schemas.microsoft.com/office/word/2010/wordprocessingInk" xmlns:wne="http://schemas.microsoft.com/office/word/2006/wordml" xmlns:wps="http://schemas.microsoft.com/office/word/2010/wordprocessingShape" mc:Ignorable="w14 w15 w16se w16cid w16 w16cex w16sdtdh wp14">
+<w:endnotes xmlns:wpc="http://schemas.microsoft.com/office/word/2010/wordprocessingCanvas" xmlns:cx="http://schemas.microsoft.com/office/drawing/2014/chartex" xmlns:cx1="http://schemas.microsoft.com/office/drawing/2015/9/8/chartex" xmlns:cx2="http://schemas.microsoft.com/office/drawing/2015/10/21/chartex" xmlns:cx3="http://schemas.microsoft.com/office/drawing/2016/5/9/chartex" xmlns:cx4="http://schemas.microsoft.com/office/drawing/2016/5/10/chartex" xmlns:cx5="http://schemas.microsoft.com/office/drawing/2016/5/11/chartex" xmlns:cx6="http://schemas.microsoft.com/office/drawing/2016/5/12/chartex" xmlns:cx7="http://schemas.microsoft.com/office/drawing/2016/5/13/chartex" xmlns:cx8="http://schemas.microsoft.com/office/drawing/2016/5/14/chartex" xmlns:mc="http://schemas.openxmlformats.org/markup-compatibility/2006" xmlns:aink="http://schemas.microsoft.com/office/drawing/2016/ink" xmlns:am3d="http://schemas.microsoft.com/office/drawing/2017/model3d" xmlns:o="urn:schemas-microsoft-com:office:office" xmlns:oel="http://schemas.microsoft.com/office/2019/extlst" xmlns:r="http://schemas.openxmlformats.org/officeDocument/2006/relationships" xmlns:m="http://schemas.openxmlformats.org/officeDocument/2006/math" xmlns:v="urn:schemas-microsoft-com:vml" xmlns:wp14="http://schemas.microsoft.com/office/word/2010/wordprocessingDrawing" xmlns:wp="http://schemas.openxmlformats.org/drawingml/2006/wordprocessingDrawing" xmlns:w10="urn:schemas-microsoft-com:office:word" xmlns:w="http://schemas.openxmlformats.org/wordprocessingml/2006/main" xmlns:w14="http://schemas.microsoft.com/office/word/2010/wordml" xmlns:w15="http://schemas.microsoft.com/office/word/2012/wordml" xmlns:w16cex="http://schemas.microsoft.com/office/word/2018/wordml/cex" xmlns:w16cid="http://schemas.microsoft.com/office/word/2016/wordml/cid" xmlns:w16="http://schemas.microsoft.com/office/word/2018/wordml" xmlns:w16du="http://schemas.microsoft.com/office/word/2023/wordml/word16du" xmlns:w16sdtdh="http://schemas.microsoft.com/office/word/2020/wordml/sdtdatahash" xmlns:w16sdtfl="http://schemas.microsoft.com/office/word/2024/wordml/sdtformatlock" xmlns:w16se="http://schemas.microsoft.com/office/word/2015/wordml/symex" xmlns:wpg="http://schemas.microsoft.com/office/word/2010/wordprocessingGroup" xmlns:wpi="http://schemas.microsoft.com/office/word/2010/wordprocessingInk" xmlns:wne="http://schemas.microsoft.com/office/word/2006/wordml" xmlns:wps="http://schemas.microsoft.com/office/word/2010/wordprocessingShape" mc:Ignorable="w14 w15 w16se w16cid w16 w16cex w16sdtdh w16sdtfl w16du wp14">
   <w:endnote w:type="separator" w:id="-1">
     <w:p>
       <w:pPr>
@@ -23636,7 +25970,7 @@
 </file>
 
 <file path=word/footer1.xml><?xml version="1.0" encoding="utf-8"?>
-<w:ftr xmlns:wpc="http://schemas.microsoft.com/office/word/2010/wordprocessingCanvas" xmlns:cx="http://schemas.microsoft.com/office/drawing/2014/chartex" xmlns:cx1="http://schemas.microsoft.com/office/drawing/2015/9/8/chartex" xmlns:cx2="http://schemas.microsoft.com/office/drawing/2015/10/21/chartex" xmlns:cx3="http://schemas.microsoft.com/office/drawing/2016/5/9/chartex" xmlns:cx4="http://schemas.microsoft.com/office/drawing/2016/5/10/chartex" xmlns:cx5="http://schemas.microsoft.com/office/drawing/2016/5/11/chartex" xmlns:cx6="http://schemas.microsoft.com/office/drawing/2016/5/12/chartex" xmlns:cx7="http://schemas.microsoft.com/office/drawing/2016/5/13/chartex" xmlns:cx8="http://schemas.microsoft.com/office/drawing/2016/5/14/chartex" xmlns:mc="http://schemas.openxmlformats.org/markup-compatibility/2006" xmlns:aink="http://schemas.microsoft.com/office/drawing/2016/ink" xmlns:am3d="http://schemas.microsoft.com/office/drawing/2017/model3d" xmlns:o="urn:schemas-microsoft-com:office:office" xmlns:oel="http://schemas.microsoft.com/office/2019/extlst" xmlns:r="http://schemas.openxmlformats.org/officeDocument/2006/relationships" xmlns:m="http://schemas.openxmlformats.org/officeDocument/2006/math" xmlns:v="urn:schemas-microsoft-com:vml" xmlns:wp14="http://schemas.microsoft.com/office/word/2010/wordprocessingDrawing" xmlns:wp="http://schemas.openxmlformats.org/drawingml/2006/wordprocessingDrawing" xmlns:w10="urn:schemas-microsoft-com:office:word" xmlns:w="http://schemas.openxmlformats.org/wordprocessingml/2006/main" xmlns:w14="http://schemas.microsoft.com/office/word/2010/wordml" xmlns:w15="http://schemas.microsoft.com/office/word/2012/wordml" xmlns:w16cex="http://schemas.microsoft.com/office/word/2018/wordml/cex" xmlns:w16cid="http://schemas.microsoft.com/office/word/2016/wordml/cid" xmlns:w16="http://schemas.microsoft.com/office/word/2018/wordml" xmlns:w16sdtdh="http://schemas.microsoft.com/office/word/2020/wordml/sdtdatahash" xmlns:w16se="http://schemas.microsoft.com/office/word/2015/wordml/symex" xmlns:wpg="http://schemas.microsoft.com/office/word/2010/wordprocessingGroup" xmlns:wpi="http://schemas.microsoft.com/office/word/2010/wordprocessingInk" xmlns:wne="http://schemas.microsoft.com/office/word/2006/wordml" xmlns:wps="http://schemas.microsoft.com/office/word/2010/wordprocessingShape" mc:Ignorable="w14 w15 w16se w16cid w16 w16cex w16sdtdh wp14">
+<w:ftr xmlns:wpc="http://schemas.microsoft.com/office/word/2010/wordprocessingCanvas" xmlns:cx="http://schemas.microsoft.com/office/drawing/2014/chartex" xmlns:cx1="http://schemas.microsoft.com/office/drawing/2015/9/8/chartex" xmlns:cx2="http://schemas.microsoft.com/office/drawing/2015/10/21/chartex" xmlns:cx3="http://schemas.microsoft.com/office/drawing/2016/5/9/chartex" xmlns:cx4="http://schemas.microsoft.com/office/drawing/2016/5/10/chartex" xmlns:cx5="http://schemas.microsoft.com/office/drawing/2016/5/11/chartex" xmlns:cx6="http://schemas.microsoft.com/office/drawing/2016/5/12/chartex" xmlns:cx7="http://schemas.microsoft.com/office/drawing/2016/5/13/chartex" xmlns:cx8="http://schemas.microsoft.com/office/drawing/2016/5/14/chartex" xmlns:mc="http://schemas.openxmlformats.org/markup-compatibility/2006" xmlns:aink="http://schemas.microsoft.com/office/drawing/2016/ink" xmlns:am3d="http://schemas.microsoft.com/office/drawing/2017/model3d" xmlns:o="urn:schemas-microsoft-com:office:office" xmlns:oel="http://schemas.microsoft.com/office/2019/extlst" xmlns:r="http://schemas.openxmlformats.org/officeDocument/2006/relationships" xmlns:m="http://schemas.openxmlformats.org/officeDocument/2006/math" xmlns:v="urn:schemas-microsoft-com:vml" xmlns:wp14="http://schemas.microsoft.com/office/word/2010/wordprocessingDrawing" xmlns:wp="http://schemas.openxmlformats.org/drawingml/2006/wordprocessingDrawing" xmlns:w10="urn:schemas-microsoft-com:office:word" xmlns:w="http://schemas.openxmlformats.org/wordprocessingml/2006/main" xmlns:w14="http://schemas.microsoft.com/office/word/2010/wordml" xmlns:w15="http://schemas.microsoft.com/office/word/2012/wordml" xmlns:w16cex="http://schemas.microsoft.com/office/word/2018/wordml/cex" xmlns:w16cid="http://schemas.microsoft.com/office/word/2016/wordml/cid" xmlns:w16="http://schemas.microsoft.com/office/word/2018/wordml" xmlns:w16du="http://schemas.microsoft.com/office/word/2023/wordml/word16du" xmlns:w16sdtdh="http://schemas.microsoft.com/office/word/2020/wordml/sdtdatahash" xmlns:w16sdtfl="http://schemas.microsoft.com/office/word/2024/wordml/sdtformatlock" xmlns:w16se="http://schemas.microsoft.com/office/word/2015/wordml/symex" xmlns:wpg="http://schemas.microsoft.com/office/word/2010/wordprocessingGroup" xmlns:wpi="http://schemas.microsoft.com/office/word/2010/wordprocessingInk" xmlns:wne="http://schemas.microsoft.com/office/word/2006/wordml" xmlns:wps="http://schemas.microsoft.com/office/word/2010/wordprocessingShape" mc:Ignorable="w14 w15 w16se w16cid w16 w16cex w16sdtdh w16sdtfl w16du wp14">
   <w:p>
     <w:pPr>
       <w:pBdr>
@@ -23818,7 +26152,7 @@
 </file>
 
 <file path=word/footer2.xml><?xml version="1.0" encoding="utf-8"?>
-<w:ftr xmlns:wpc="http://schemas.microsoft.com/office/word/2010/wordprocessingCanvas" xmlns:cx="http://schemas.microsoft.com/office/drawing/2014/chartex" xmlns:cx1="http://schemas.microsoft.com/office/drawing/2015/9/8/chartex" xmlns:cx2="http://schemas.microsoft.com/office/drawing/2015/10/21/chartex" xmlns:cx3="http://schemas.microsoft.com/office/drawing/2016/5/9/chartex" xmlns:cx4="http://schemas.microsoft.com/office/drawing/2016/5/10/chartex" xmlns:cx5="http://schemas.microsoft.com/office/drawing/2016/5/11/chartex" xmlns:cx6="http://schemas.microsoft.com/office/drawing/2016/5/12/chartex" xmlns:cx7="http://schemas.microsoft.com/office/drawing/2016/5/13/chartex" xmlns:cx8="http://schemas.microsoft.com/office/drawing/2016/5/14/chartex" xmlns:mc="http://schemas.openxmlformats.org/markup-compatibility/2006" xmlns:aink="http://schemas.microsoft.com/office/drawing/2016/ink" xmlns:am3d="http://schemas.microsoft.com/office/drawing/2017/model3d" xmlns:o="urn:schemas-microsoft-com:office:office" xmlns:oel="http://schemas.microsoft.com/office/2019/extlst" xmlns:r="http://schemas.openxmlformats.org/officeDocument/2006/relationships" xmlns:m="http://schemas.openxmlformats.org/officeDocument/2006/math" xmlns:v="urn:schemas-microsoft-com:vml" xmlns:wp14="http://schemas.microsoft.com/office/word/2010/wordprocessingDrawing" xmlns:wp="http://schemas.openxmlformats.org/drawingml/2006/wordprocessingDrawing" xmlns:w10="urn:schemas-microsoft-com:office:word" xmlns:w="http://schemas.openxmlformats.org/wordprocessingml/2006/main" xmlns:w14="http://schemas.microsoft.com/office/word/2010/wordml" xmlns:w15="http://schemas.microsoft.com/office/word/2012/wordml" xmlns:w16cex="http://schemas.microsoft.com/office/word/2018/wordml/cex" xmlns:w16cid="http://schemas.microsoft.com/office/word/2016/wordml/cid" xmlns:w16="http://schemas.microsoft.com/office/word/2018/wordml" xmlns:w16sdtdh="http://schemas.microsoft.com/office/word/2020/wordml/sdtdatahash" xmlns:w16se="http://schemas.microsoft.com/office/word/2015/wordml/symex" xmlns:wpg="http://schemas.microsoft.com/office/word/2010/wordprocessingGroup" xmlns:wpi="http://schemas.microsoft.com/office/word/2010/wordprocessingInk" xmlns:wne="http://schemas.microsoft.com/office/word/2006/wordml" xmlns:wps="http://schemas.microsoft.com/office/word/2010/wordprocessingShape" mc:Ignorable="w14 w15 w16se w16cid w16 w16cex w16sdtdh wp14">
+<w:ftr xmlns:wpc="http://schemas.microsoft.com/office/word/2010/wordprocessingCanvas" xmlns:cx="http://schemas.microsoft.com/office/drawing/2014/chartex" xmlns:cx1="http://schemas.microsoft.com/office/drawing/2015/9/8/chartex" xmlns:cx2="http://schemas.microsoft.com/office/drawing/2015/10/21/chartex" xmlns:cx3="http://schemas.microsoft.com/office/drawing/2016/5/9/chartex" xmlns:cx4="http://schemas.microsoft.com/office/drawing/2016/5/10/chartex" xmlns:cx5="http://schemas.microsoft.com/office/drawing/2016/5/11/chartex" xmlns:cx6="http://schemas.microsoft.com/office/drawing/2016/5/12/chartex" xmlns:cx7="http://schemas.microsoft.com/office/drawing/2016/5/13/chartex" xmlns:cx8="http://schemas.microsoft.com/office/drawing/2016/5/14/chartex" xmlns:mc="http://schemas.openxmlformats.org/markup-compatibility/2006" xmlns:aink="http://schemas.microsoft.com/office/drawing/2016/ink" xmlns:am3d="http://schemas.microsoft.com/office/drawing/2017/model3d" xmlns:o="urn:schemas-microsoft-com:office:office" xmlns:oel="http://schemas.microsoft.com/office/2019/extlst" xmlns:r="http://schemas.openxmlformats.org/officeDocument/2006/relationships" xmlns:m="http://schemas.openxmlformats.org/officeDocument/2006/math" xmlns:v="urn:schemas-microsoft-com:vml" xmlns:wp14="http://schemas.microsoft.com/office/word/2010/wordprocessingDrawing" xmlns:wp="http://schemas.openxmlformats.org/drawingml/2006/wordprocessingDrawing" xmlns:w10="urn:schemas-microsoft-com:office:word" xmlns:w="http://schemas.openxmlformats.org/wordprocessingml/2006/main" xmlns:w14="http://schemas.microsoft.com/office/word/2010/wordml" xmlns:w15="http://schemas.microsoft.com/office/word/2012/wordml" xmlns:w16cex="http://schemas.microsoft.com/office/word/2018/wordml/cex" xmlns:w16cid="http://schemas.microsoft.com/office/word/2016/wordml/cid" xmlns:w16="http://schemas.microsoft.com/office/word/2018/wordml" xmlns:w16du="http://schemas.microsoft.com/office/word/2023/wordml/word16du" xmlns:w16sdtdh="http://schemas.microsoft.com/office/word/2020/wordml/sdtdatahash" xmlns:w16sdtfl="http://schemas.microsoft.com/office/word/2024/wordml/sdtformatlock" xmlns:w16se="http://schemas.microsoft.com/office/word/2015/wordml/symex" xmlns:wpg="http://schemas.microsoft.com/office/word/2010/wordprocessingGroup" xmlns:wpi="http://schemas.microsoft.com/office/word/2010/wordprocessingInk" xmlns:wne="http://schemas.microsoft.com/office/word/2006/wordml" xmlns:wps="http://schemas.microsoft.com/office/word/2010/wordprocessingShape" mc:Ignorable="w14 w15 w16se w16cid w16 w16cex w16sdtdh w16sdtfl w16du wp14">
   <w:p>
     <w:pPr>
       <w:pBdr>
@@ -24014,7 +26348,7 @@
 </file>
 
 <file path=word/footnotes.xml><?xml version="1.0" encoding="utf-8"?>
-<w:footnotes xmlns:wpc="http://schemas.microsoft.com/office/word/2010/wordprocessingCanvas" xmlns:cx="http://schemas.microsoft.com/office/drawing/2014/chartex" xmlns:cx1="http://schemas.microsoft.com/office/drawing/2015/9/8/chartex" xmlns:cx2="http://schemas.microsoft.com/office/drawing/2015/10/21/chartex" xmlns:cx3="http://schemas.microsoft.com/office/drawing/2016/5/9/chartex" xmlns:cx4="http://schemas.microsoft.com/office/drawing/2016/5/10/chartex" xmlns:cx5="http://schemas.microsoft.com/office/drawing/2016/5/11/chartex" xmlns:cx6="http://schemas.microsoft.com/office/drawing/2016/5/12/chartex" xmlns:cx7="http://schemas.microsoft.com/office/drawing/2016/5/13/chartex" xmlns:cx8="http://schemas.microsoft.com/office/drawing/2016/5/14/chartex" xmlns:mc="http://schemas.openxmlformats.org/markup-compatibility/2006" xmlns:aink="http://schemas.microsoft.com/office/drawing/2016/ink" xmlns:am3d="http://schemas.microsoft.com/office/drawing/2017/model3d" xmlns:o="urn:schemas-microsoft-com:office:office" xmlns:oel="http://schemas.microsoft.com/office/2019/extlst" xmlns:r="http://schemas.openxmlformats.org/officeDocument/2006/relationships" xmlns:m="http://schemas.openxmlformats.org/officeDocument/2006/math" xmlns:v="urn:schemas-microsoft-com:vml" xmlns:wp14="http://schemas.microsoft.com/office/word/2010/wordprocessingDrawing" xmlns:wp="http://schemas.openxmlformats.org/drawingml/2006/wordprocessingDrawing" xmlns:w10="urn:schemas-microsoft-com:office:word" xmlns:w="http://schemas.openxmlformats.org/wordprocessingml/2006/main" xmlns:w14="http://schemas.microsoft.com/office/word/2010/wordml" xmlns:w15="http://schemas.microsoft.com/office/word/2012/wordml" xmlns:w16cex="http://schemas.microsoft.com/office/word/2018/wordml/cex" xmlns:w16cid="http://schemas.microsoft.com/office/word/2016/wordml/cid" xmlns:w16="http://schemas.microsoft.com/office/word/2018/wordml" xmlns:w16sdtdh="http://schemas.microsoft.com/office/word/2020/wordml/sdtdatahash" xmlns:w16se="http://schemas.microsoft.com/office/word/2015/wordml/symex" xmlns:wpg="http://schemas.microsoft.com/office/word/2010/wordprocessingGroup" xmlns:wpi="http://schemas.microsoft.com/office/word/2010/wordprocessingInk" xmlns:wne="http://schemas.microsoft.com/office/word/2006/wordml" xmlns:wps="http://schemas.microsoft.com/office/word/2010/wordprocessingShape" mc:Ignorable="w14 w15 w16se w16cid w16 w16cex w16sdtdh wp14">
+<w:footnotes xmlns:wpc="http://schemas.microsoft.com/office/word/2010/wordprocessingCanvas" xmlns:cx="http://schemas.microsoft.com/office/drawing/2014/chartex" xmlns:cx1="http://schemas.microsoft.com/office/drawing/2015/9/8/chartex" xmlns:cx2="http://schemas.microsoft.com/office/drawing/2015/10/21/chartex" xmlns:cx3="http://schemas.microsoft.com/office/drawing/2016/5/9/chartex" xmlns:cx4="http://schemas.microsoft.com/office/drawing/2016/5/10/chartex" xmlns:cx5="http://schemas.microsoft.com/office/drawing/2016/5/11/chartex" xmlns:cx6="http://schemas.microsoft.com/office/drawing/2016/5/12/chartex" xmlns:cx7="http://schemas.microsoft.com/office/drawing/2016/5/13/chartex" xmlns:cx8="http://schemas.microsoft.com/office/drawing/2016/5/14/chartex" xmlns:mc="http://schemas.openxmlformats.org/markup-compatibility/2006" xmlns:aink="http://schemas.microsoft.com/office/drawing/2016/ink" xmlns:am3d="http://schemas.microsoft.com/office/drawing/2017/model3d" xmlns:o="urn:schemas-microsoft-com:office:office" xmlns:oel="http://schemas.microsoft.com/office/2019/extlst" xmlns:r="http://schemas.openxmlformats.org/officeDocument/2006/relationships" xmlns:m="http://schemas.openxmlformats.org/officeDocument/2006/math" xmlns:v="urn:schemas-microsoft-com:vml" xmlns:wp14="http://schemas.microsoft.com/office/word/2010/wordprocessingDrawing" xmlns:wp="http://schemas.openxmlformats.org/drawingml/2006/wordprocessingDrawing" xmlns:w10="urn:schemas-microsoft-com:office:word" xmlns:w="http://schemas.openxmlformats.org/wordprocessingml/2006/main" xmlns:w14="http://schemas.microsoft.com/office/word/2010/wordml" xmlns:w15="http://schemas.microsoft.com/office/word/2012/wordml" xmlns:w16cex="http://schemas.microsoft.com/office/word/2018/wordml/cex" xmlns:w16cid="http://schemas.microsoft.com/office/word/2016/wordml/cid" xmlns:w16="http://schemas.microsoft.com/office/word/2018/wordml" xmlns:w16du="http://schemas.microsoft.com/office/word/2023/wordml/word16du" xmlns:w16sdtdh="http://schemas.microsoft.com/office/word/2020/wordml/sdtdatahash" xmlns:w16sdtfl="http://schemas.microsoft.com/office/word/2024/wordml/sdtformatlock" xmlns:w16se="http://schemas.microsoft.com/office/word/2015/wordml/symex" xmlns:wpg="http://schemas.microsoft.com/office/word/2010/wordprocessingGroup" xmlns:wpi="http://schemas.microsoft.com/office/word/2010/wordprocessingInk" xmlns:wne="http://schemas.microsoft.com/office/word/2006/wordml" xmlns:wps="http://schemas.microsoft.com/office/word/2010/wordprocessingShape" mc:Ignorable="w14 w15 w16se w16cid w16 w16cex w16sdtdh w16sdtfl w16du wp14">
   <w:footnote w:type="separator" w:id="-1">
     <w:p>
       <w:pPr>
@@ -24039,7 +26373,7 @@
 </file>
 
 <file path=word/header1.xml><?xml version="1.0" encoding="utf-8"?>
-<w:hdr xmlns:wpc="http://schemas.microsoft.com/office/word/2010/wordprocessingCanvas" xmlns:cx="http://schemas.microsoft.com/office/drawing/2014/chartex" xmlns:cx1="http://schemas.microsoft.com/office/drawing/2015/9/8/chartex" xmlns:cx2="http://schemas.microsoft.com/office/drawing/2015/10/21/chartex" xmlns:cx3="http://schemas.microsoft.com/office/drawing/2016/5/9/chartex" xmlns:cx4="http://schemas.microsoft.com/office/drawing/2016/5/10/chartex" xmlns:cx5="http://schemas.microsoft.com/office/drawing/2016/5/11/chartex" xmlns:cx6="http://schemas.microsoft.com/office/drawing/2016/5/12/chartex" xmlns:cx7="http://schemas.microsoft.com/office/drawing/2016/5/13/chartex" xmlns:cx8="http://schemas.microsoft.com/office/drawing/2016/5/14/chartex" xmlns:mc="http://schemas.openxmlformats.org/markup-compatibility/2006" xmlns:aink="http://schemas.microsoft.com/office/drawing/2016/ink" xmlns:am3d="http://schemas.microsoft.com/office/drawing/2017/model3d" xmlns:o="urn:schemas-microsoft-com:office:office" xmlns:oel="http://schemas.microsoft.com/office/2019/extlst" xmlns:r="http://schemas.openxmlformats.org/officeDocument/2006/relationships" xmlns:m="http://schemas.openxmlformats.org/officeDocument/2006/math" xmlns:v="urn:schemas-microsoft-com:vml" xmlns:wp14="http://schemas.microsoft.com/office/word/2010/wordprocessingDrawing" xmlns:wp="http://schemas.openxmlformats.org/drawingml/2006/wordprocessingDrawing" xmlns:w10="urn:schemas-microsoft-com:office:word" xmlns:w="http://schemas.openxmlformats.org/wordprocessingml/2006/main" xmlns:w14="http://schemas.microsoft.com/office/word/2010/wordml" xmlns:w15="http://schemas.microsoft.com/office/word/2012/wordml" xmlns:w16cex="http://schemas.microsoft.com/office/word/2018/wordml/cex" xmlns:w16cid="http://schemas.microsoft.com/office/word/2016/wordml/cid" xmlns:w16="http://schemas.microsoft.com/office/word/2018/wordml" xmlns:w16sdtdh="http://schemas.microsoft.com/office/word/2020/wordml/sdtdatahash" xmlns:w16se="http://schemas.microsoft.com/office/word/2015/wordml/symex" xmlns:wpg="http://schemas.microsoft.com/office/word/2010/wordprocessingGroup" xmlns:wpi="http://schemas.microsoft.com/office/word/2010/wordprocessingInk" xmlns:wne="http://schemas.microsoft.com/office/word/2006/wordml" xmlns:wps="http://schemas.microsoft.com/office/word/2010/wordprocessingShape" mc:Ignorable="w14 w15 w16se w16cid w16 w16cex w16sdtdh wp14">
+<w:hdr xmlns:wpc="http://schemas.microsoft.com/office/word/2010/wordprocessingCanvas" xmlns:cx="http://schemas.microsoft.com/office/drawing/2014/chartex" xmlns:cx1="http://schemas.microsoft.com/office/drawing/2015/9/8/chartex" xmlns:cx2="http://schemas.microsoft.com/office/drawing/2015/10/21/chartex" xmlns:cx3="http://schemas.microsoft.com/office/drawing/2016/5/9/chartex" xmlns:cx4="http://schemas.microsoft.com/office/drawing/2016/5/10/chartex" xmlns:cx5="http://schemas.microsoft.com/office/drawing/2016/5/11/chartex" xmlns:cx6="http://schemas.microsoft.com/office/drawing/2016/5/12/chartex" xmlns:cx7="http://schemas.microsoft.com/office/drawing/2016/5/13/chartex" xmlns:cx8="http://schemas.microsoft.com/office/drawing/2016/5/14/chartex" xmlns:mc="http://schemas.openxmlformats.org/markup-compatibility/2006" xmlns:aink="http://schemas.microsoft.com/office/drawing/2016/ink" xmlns:am3d="http://schemas.microsoft.com/office/drawing/2017/model3d" xmlns:o="urn:schemas-microsoft-com:office:office" xmlns:oel="http://schemas.microsoft.com/office/2019/extlst" xmlns:r="http://schemas.openxmlformats.org/officeDocument/2006/relationships" xmlns:m="http://schemas.openxmlformats.org/officeDocument/2006/math" xmlns:v="urn:schemas-microsoft-com:vml" xmlns:wp14="http://schemas.microsoft.com/office/word/2010/wordprocessingDrawing" xmlns:wp="http://schemas.openxmlformats.org/drawingml/2006/wordprocessingDrawing" xmlns:w10="urn:schemas-microsoft-com:office:word" xmlns:w="http://schemas.openxmlformats.org/wordprocessingml/2006/main" xmlns:w14="http://schemas.microsoft.com/office/word/2010/wordml" xmlns:w15="http://schemas.microsoft.com/office/word/2012/wordml" xmlns:w16cex="http://schemas.microsoft.com/office/word/2018/wordml/cex" xmlns:w16cid="http://schemas.microsoft.com/office/word/2016/wordml/cid" xmlns:w16="http://schemas.microsoft.com/office/word/2018/wordml" xmlns:w16du="http://schemas.microsoft.com/office/word/2023/wordml/word16du" xmlns:w16sdtdh="http://schemas.microsoft.com/office/word/2020/wordml/sdtdatahash" xmlns:w16sdtfl="http://schemas.microsoft.com/office/word/2024/wordml/sdtformatlock" xmlns:w16se="http://schemas.microsoft.com/office/word/2015/wordml/symex" xmlns:wpg="http://schemas.microsoft.com/office/word/2010/wordprocessingGroup" xmlns:wpi="http://schemas.microsoft.com/office/word/2010/wordprocessingInk" xmlns:wne="http://schemas.microsoft.com/office/word/2006/wordml" xmlns:wps="http://schemas.microsoft.com/office/word/2010/wordprocessingShape" mc:Ignorable="w14 w15 w16se w16cid w16 w16cex w16sdtdh w16sdtfl w16du wp14">
   <w:p>
     <w:pPr>
       <w:pStyle w:val="Header"/>
@@ -24060,7 +26394,7 @@
 </file>
 
 <file path=word/header2.xml><?xml version="1.0" encoding="utf-8"?>
-<w:hdr xmlns:wpc="http://schemas.microsoft.com/office/word/2010/wordprocessingCanvas" xmlns:cx="http://schemas.microsoft.com/office/drawing/2014/chartex" xmlns:cx1="http://schemas.microsoft.com/office/drawing/2015/9/8/chartex" xmlns:cx2="http://schemas.microsoft.com/office/drawing/2015/10/21/chartex" xmlns:cx3="http://schemas.microsoft.com/office/drawing/2016/5/9/chartex" xmlns:cx4="http://schemas.microsoft.com/office/drawing/2016/5/10/chartex" xmlns:cx5="http://schemas.microsoft.com/office/drawing/2016/5/11/chartex" xmlns:cx6="http://schemas.microsoft.com/office/drawing/2016/5/12/chartex" xmlns:cx7="http://schemas.microsoft.com/office/drawing/2016/5/13/chartex" xmlns:cx8="http://schemas.microsoft.com/office/drawing/2016/5/14/chartex" xmlns:mc="http://schemas.openxmlformats.org/markup-compatibility/2006" xmlns:aink="http://schemas.microsoft.com/office/drawing/2016/ink" xmlns:am3d="http://schemas.microsoft.com/office/drawing/2017/model3d" xmlns:o="urn:schemas-microsoft-com:office:office" xmlns:oel="http://schemas.microsoft.com/office/2019/extlst" xmlns:r="http://schemas.openxmlformats.org/officeDocument/2006/relationships" xmlns:m="http://schemas.openxmlformats.org/officeDocument/2006/math" xmlns:v="urn:schemas-microsoft-com:vml" xmlns:wp14="http://schemas.microsoft.com/office/word/2010/wordprocessingDrawing" xmlns:wp="http://schemas.openxmlformats.org/drawingml/2006/wordprocessingDrawing" xmlns:w10="urn:schemas-microsoft-com:office:word" xmlns:w="http://schemas.openxmlformats.org/wordprocessingml/2006/main" xmlns:w14="http://schemas.microsoft.com/office/word/2010/wordml" xmlns:w15="http://schemas.microsoft.com/office/word/2012/wordml" xmlns:w16cex="http://schemas.microsoft.com/office/word/2018/wordml/cex" xmlns:w16cid="http://schemas.microsoft.com/office/word/2016/wordml/cid" xmlns:w16="http://schemas.microsoft.com/office/word/2018/wordml" xmlns:w16sdtdh="http://schemas.microsoft.com/office/word/2020/wordml/sdtdatahash" xmlns:w16se="http://schemas.microsoft.com/office/word/2015/wordml/symex" xmlns:wpg="http://schemas.microsoft.com/office/word/2010/wordprocessingGroup" xmlns:wpi="http://schemas.microsoft.com/office/word/2010/wordprocessingInk" xmlns:wne="http://schemas.microsoft.com/office/word/2006/wordml" xmlns:wps="http://schemas.microsoft.com/office/word/2010/wordprocessingShape" mc:Ignorable="w14 w15 w16se w16cid w16 w16cex w16sdtdh wp14">
+<w:hdr xmlns:wpc="http://schemas.microsoft.com/office/word/2010/wordprocessingCanvas" xmlns:cx="http://schemas.microsoft.com/office/drawing/2014/chartex" xmlns:cx1="http://schemas.microsoft.com/office/drawing/2015/9/8/chartex" xmlns:cx2="http://schemas.microsoft.com/office/drawing/2015/10/21/chartex" xmlns:cx3="http://schemas.microsoft.com/office/drawing/2016/5/9/chartex" xmlns:cx4="http://schemas.microsoft.com/office/drawing/2016/5/10/chartex" xmlns:cx5="http://schemas.microsoft.com/office/drawing/2016/5/11/chartex" xmlns:cx6="http://schemas.microsoft.com/office/drawing/2016/5/12/chartex" xmlns:cx7="http://schemas.microsoft.com/office/drawing/2016/5/13/chartex" xmlns:cx8="http://schemas.microsoft.com/office/drawing/2016/5/14/chartex" xmlns:mc="http://schemas.openxmlformats.org/markup-compatibility/2006" xmlns:aink="http://schemas.microsoft.com/office/drawing/2016/ink" xmlns:am3d="http://schemas.microsoft.com/office/drawing/2017/model3d" xmlns:o="urn:schemas-microsoft-com:office:office" xmlns:oel="http://schemas.microsoft.com/office/2019/extlst" xmlns:r="http://schemas.openxmlformats.org/officeDocument/2006/relationships" xmlns:m="http://schemas.openxmlformats.org/officeDocument/2006/math" xmlns:v="urn:schemas-microsoft-com:vml" xmlns:wp14="http://schemas.microsoft.com/office/word/2010/wordprocessingDrawing" xmlns:wp="http://schemas.openxmlformats.org/drawingml/2006/wordprocessingDrawing" xmlns:w10="urn:schemas-microsoft-com:office:word" xmlns:w="http://schemas.openxmlformats.org/wordprocessingml/2006/main" xmlns:w14="http://schemas.microsoft.com/office/word/2010/wordml" xmlns:w15="http://schemas.microsoft.com/office/word/2012/wordml" xmlns:w16cex="http://schemas.microsoft.com/office/word/2018/wordml/cex" xmlns:w16cid="http://schemas.microsoft.com/office/word/2016/wordml/cid" xmlns:w16="http://schemas.microsoft.com/office/word/2018/wordml" xmlns:w16du="http://schemas.microsoft.com/office/word/2023/wordml/word16du" xmlns:w16sdtdh="http://schemas.microsoft.com/office/word/2020/wordml/sdtdatahash" xmlns:w16sdtfl="http://schemas.microsoft.com/office/word/2024/wordml/sdtformatlock" xmlns:w16se="http://schemas.microsoft.com/office/word/2015/wordml/symex" xmlns:wpg="http://schemas.microsoft.com/office/word/2010/wordprocessingGroup" xmlns:wpi="http://schemas.microsoft.com/office/word/2010/wordprocessingInk" xmlns:wne="http://schemas.microsoft.com/office/word/2006/wordml" xmlns:wps="http://schemas.microsoft.com/office/word/2010/wordprocessingShape" mc:Ignorable="w14 w15 w16se w16cid w16 w16cex w16sdtdh w16sdtfl w16du wp14">
   <w:p>
     <w:pPr>
       <w:pStyle w:val="Header"/>
@@ -24073,7 +26407,7 @@
 </file>
 
 <file path=word/styles.xml><?xml version="1.0" encoding="utf-8"?>
-<w:styles xmlns:mc="http://schemas.openxmlformats.org/markup-compatibility/2006" xmlns:r="http://schemas.openxmlformats.org/officeDocument/2006/relationships" xmlns:w="http://schemas.openxmlformats.org/wordprocessingml/2006/main" xmlns:w14="http://schemas.microsoft.com/office/word/2010/wordml" xmlns:w15="http://schemas.microsoft.com/office/word/2012/wordml" xmlns:w16cex="http://schemas.microsoft.com/office/word/2018/wordml/cex" xmlns:w16cid="http://schemas.microsoft.com/office/word/2016/wordml/cid" xmlns:w16="http://schemas.microsoft.com/office/word/2018/wordml" xmlns:w16sdtdh="http://schemas.microsoft.com/office/word/2020/wordml/sdtdatahash" xmlns:w16se="http://schemas.microsoft.com/office/word/2015/wordml/symex" mc:Ignorable="w14 w15 w16se w16cid w16 w16cex w16sdtdh">
+<w:styles xmlns:mc="http://schemas.openxmlformats.org/markup-compatibility/2006" xmlns:r="http://schemas.openxmlformats.org/officeDocument/2006/relationships" xmlns:w="http://schemas.openxmlformats.org/wordprocessingml/2006/main" xmlns:w14="http://schemas.microsoft.com/office/word/2010/wordml" xmlns:w15="http://schemas.microsoft.com/office/word/2012/wordml" xmlns:w16cex="http://schemas.microsoft.com/office/word/2018/wordml/cex" xmlns:w16cid="http://schemas.microsoft.com/office/word/2016/wordml/cid" xmlns:w16="http://schemas.microsoft.com/office/word/2018/wordml" xmlns:w16du="http://schemas.microsoft.com/office/word/2023/wordml/word16du" xmlns:w16sdtdh="http://schemas.microsoft.com/office/word/2020/wordml/sdtdatahash" xmlns:w16sdtfl="http://schemas.microsoft.com/office/word/2024/wordml/sdtformatlock" xmlns:w16se="http://schemas.microsoft.com/office/word/2015/wordml/symex" mc:Ignorable="w14 w15 w16se w16cid w16 w16cex w16sdtdh w16sdtfl w16du">
   <w:docDefaults>
     <w:rPrDefault>
       <w:rPr>

</xml_diff>

<commit_message>
nmv 27 05 2026
</commit_message>
<xml_diff>
--- a/TS Jatai Ghanam Project/TS 1.1/TS 1.1 Ghanam Malayalam Corrections.docx
+++ b/TS Jatai Ghanam Project/TS 1.1/TS 1.1 Ghanam Malayalam Corrections.docx
@@ -7985,51 +7985,6 @@
           </w:p>
         </w:tc>
       </w:tr>
-      <w:tr>
-        <w:trPr>
-          <w:trHeight w:val="2600"/>
-        </w:trPr>
-        <w:tc>
-          <w:tcPr>
-            <w:tcW w:w="6408" w:type="dxa"/>
-          </w:tcPr>
-          <w:p>
-            <w:pPr>
-              <w:widowControl w:val="0"/>
-              <w:autoSpaceDE w:val="0"/>
-              <w:autoSpaceDN w:val="0"/>
-              <w:adjustRightInd w:val="0"/>
-              <w:spacing w:line="240" w:lineRule="auto"/>
-              <w:rPr>
-                <w:rFonts w:cs="BRH Malayalam Extra"/>
-                <w:color w:val="000000"/>
-                <w:szCs w:val="40"/>
-                <w:lang w:val="it-IT"/>
-              </w:rPr>
-            </w:pPr>
-          </w:p>
-        </w:tc>
-        <w:tc>
-          <w:tcPr>
-            <w:tcW w:w="7513" w:type="dxa"/>
-          </w:tcPr>
-          <w:p>
-            <w:pPr>
-              <w:widowControl w:val="0"/>
-              <w:autoSpaceDE w:val="0"/>
-              <w:autoSpaceDN w:val="0"/>
-              <w:adjustRightInd w:val="0"/>
-              <w:spacing w:line="240" w:lineRule="auto"/>
-              <w:rPr>
-                <w:rFonts w:cs="BRH Malayalam Extra"/>
-                <w:color w:val="000000"/>
-                <w:szCs w:val="40"/>
-                <w:lang w:val="it-IT"/>
-              </w:rPr>
-            </w:pPr>
-          </w:p>
-        </w:tc>
-      </w:tr>
     </w:tbl>
     <w:p>
       <w:pPr>
@@ -8044,6 +7999,18 @@
           <w:lang w:val="it-IT"/>
         </w:rPr>
       </w:pPr>
+      <w:r>
+        <w:rPr>
+          <w:b/>
+          <w:bCs/>
+          <w:sz w:val="32"/>
+          <w:szCs w:val="32"/>
+          <w:u w:val="single"/>
+          <w:lang w:val="it-IT"/>
+        </w:rPr>
+        <w:lastRenderedPageBreak/>
+        <w:t>==============</w:t>
+      </w:r>
     </w:p>
     <w:p>
       <w:pPr>
@@ -9748,7 +9715,6 @@
                 <w:sz w:val="28"/>
                 <w:szCs w:val="32"/>
               </w:rPr>
-              <w:lastRenderedPageBreak/>
               <w:t>Where ever In padam line and vaakyam line</w:t>
             </w:r>
             <w:r>
@@ -9867,41 +9833,6 @@
               </w:rPr>
               <w:t xml:space="preserve">  </w:t>
             </w:r>
-          </w:p>
-        </w:tc>
-      </w:tr>
-      <w:tr>
-        <w:trPr>
-          <w:trHeight w:val="1060"/>
-        </w:trPr>
-        <w:tc>
-          <w:tcPr>
-            <w:tcW w:w="7259" w:type="dxa"/>
-          </w:tcPr>
-          <w:p>
-            <w:pPr>
-              <w:spacing w:before="0" w:line="240" w:lineRule="auto"/>
-              <w:rPr>
-                <w:rFonts w:ascii="BRH Malayalam Extra" w:hAnsi="BRH Malayalam Extra" w:cs="BRH Malayalam Extra"/>
-                <w:sz w:val="28"/>
-                <w:szCs w:val="36"/>
-              </w:rPr>
-            </w:pPr>
-          </w:p>
-        </w:tc>
-        <w:tc>
-          <w:tcPr>
-            <w:tcW w:w="7371" w:type="dxa"/>
-          </w:tcPr>
-          <w:p>
-            <w:pPr>
-              <w:pStyle w:val="NoSpacing"/>
-              <w:rPr>
-                <w:rFonts w:ascii="BRH Malayalam Extra" w:hAnsi="BRH Malayalam Extra" w:cs="BRH Malayalam Extra"/>
-                <w:sz w:val="28"/>
-                <w:szCs w:val="36"/>
-              </w:rPr>
-            </w:pPr>
           </w:p>
         </w:tc>
       </w:tr>
@@ -9939,6 +9870,7 @@
                 <w:color w:val="000000"/>
                 <w:szCs w:val="40"/>
               </w:rPr>
+              <w:lastRenderedPageBreak/>
               <w:t>54</w:t>
             </w:r>
             <w:r>
@@ -12170,7 +12102,6 @@
                 <w:color w:val="000000"/>
                 <w:szCs w:val="40"/>
               </w:rPr>
-              <w:lastRenderedPageBreak/>
               <w:t>3</w:t>
             </w:r>
             <w:r>
@@ -12620,6 +12551,7 @@
                 <w:color w:val="000000"/>
                 <w:szCs w:val="40"/>
               </w:rPr>
+              <w:lastRenderedPageBreak/>
               <w:t>4</w:t>
             </w:r>
             <w:r>
@@ -12984,6 +12916,7 @@
                 <w:color w:val="000000"/>
                 <w:szCs w:val="40"/>
               </w:rPr>
+              <w:lastRenderedPageBreak/>
               <w:t>3</w:t>
             </w:r>
             <w:r>
@@ -13511,6 +13444,7 @@
                 <w:color w:val="000000"/>
                 <w:szCs w:val="40"/>
               </w:rPr>
+              <w:lastRenderedPageBreak/>
               <w:t>4</w:t>
             </w:r>
             <w:r>
@@ -13886,6 +13820,7 @@
                 <w:highlight w:val="yellow"/>
                 <w:u w:val="single"/>
               </w:rPr>
+              <w:lastRenderedPageBreak/>
               <w:t>TS 1.1.8.1 Ghanam</w:t>
             </w:r>
           </w:p>
@@ -14538,7 +14473,6 @@
                 <w:color w:val="000000"/>
                 <w:szCs w:val="40"/>
               </w:rPr>
-              <w:lastRenderedPageBreak/>
               <w:t>26</w:t>
             </w:r>
             <w:r>
@@ -15436,6 +15370,7 @@
                 <w:color w:val="000000"/>
                 <w:szCs w:val="40"/>
               </w:rPr>
+              <w:lastRenderedPageBreak/>
               <w:t>47</w:t>
             </w:r>
             <w:r>
@@ -15745,6 +15680,7 @@
                 <w:color w:val="000000"/>
                 <w:szCs w:val="40"/>
               </w:rPr>
+              <w:lastRenderedPageBreak/>
               <w:t>46</w:t>
             </w:r>
             <w:r>
@@ -16223,6 +16159,7 @@
                 <w:color w:val="000000"/>
                 <w:szCs w:val="40"/>
               </w:rPr>
+              <w:lastRenderedPageBreak/>
               <w:t>47</w:t>
             </w:r>
             <w:r>
@@ -16556,6 +16493,7 @@
                 <w:color w:val="000000"/>
                 <w:szCs w:val="40"/>
               </w:rPr>
+              <w:lastRenderedPageBreak/>
               <w:t>43</w:t>
             </w:r>
             <w:r>
@@ -17418,7 +17356,6 @@
                 <w:sz w:val="32"/>
                 <w:szCs w:val="40"/>
               </w:rPr>
-              <w:lastRenderedPageBreak/>
               <w:t>¥b</w:t>
             </w:r>
             <w:r>
@@ -18245,7 +18182,6 @@
                 <w:color w:val="000000"/>
                 <w:szCs w:val="40"/>
               </w:rPr>
-              <w:lastRenderedPageBreak/>
               <w:t>43</w:t>
             </w:r>
             <w:r>
@@ -19122,7 +19058,6 @@
                 <w:sz w:val="32"/>
                 <w:szCs w:val="40"/>
               </w:rPr>
-              <w:lastRenderedPageBreak/>
               <w:t>¥b</w:t>
             </w:r>
             <w:r>
@@ -19903,6 +19838,7 @@
                 <w:color w:val="000000"/>
                 <w:szCs w:val="40"/>
               </w:rPr>
+              <w:lastRenderedPageBreak/>
               <w:t>39</w:t>
             </w:r>
             <w:r>
@@ -20501,7 +20437,6 @@
                 <w:szCs w:val="40"/>
                 <w:lang w:val="it-IT"/>
               </w:rPr>
-              <w:lastRenderedPageBreak/>
               <w:t>26</w:t>
             </w:r>
             <w:r>
@@ -29808,6 +29743,7 @@
                 <w:szCs w:val="40"/>
                 <w:highlight w:val="green"/>
               </w:rPr>
+              <w:lastRenderedPageBreak/>
               <w:t>C</w:t>
             </w:r>
             <w:r>
@@ -29933,7 +29869,6 @@
                 <w:sz w:val="32"/>
                 <w:szCs w:val="40"/>
               </w:rPr>
-              <w:lastRenderedPageBreak/>
               <w:t>Cö</w:t>
             </w:r>
             <w:r>
@@ -30370,6 +30305,16 @@
           <w:u w:val="single"/>
         </w:rPr>
       </w:pPr>
+      <w:r>
+        <w:rPr>
+          <w:b/>
+          <w:bCs/>
+          <w:sz w:val="32"/>
+          <w:szCs w:val="32"/>
+          <w:u w:val="single"/>
+        </w:rPr>
+        <w:t>=================</w:t>
+      </w:r>
     </w:p>
     <w:p>
       <w:pPr>

</xml_diff>